<commit_message>
#Misc - Added the image for HTTP server. - Added the uIP stack zip file.
</commit_message>
<xml_diff>
--- a/Ethernet_Port/Docs and Reference Codes/Plan.docx
+++ b/Ethernet_Port/Docs and Reference Codes/Plan.docx
@@ -243,11 +243,9 @@
       <w:r>
         <w:t>Link the LWIP with ENC28J60 device using port files “</w:t>
       </w:r>
-      <w:proofErr w:type="spellStart"/>
       <w:r>
         <w:t>ethernetif.c</w:t>
       </w:r>
-      <w:proofErr w:type="spellEnd"/>
       <w:r>
         <w:t>”.</w:t>
       </w:r>
@@ -291,15 +289,7 @@
         <w:pStyle w:val="NoSpacing"/>
       </w:pPr>
       <w:r>
-        <w:t xml:space="preserve">If Loopback not possible then </w:t>
-      </w:r>
-      <w:proofErr w:type="gramStart"/>
-      <w:r>
-        <w:t>Add</w:t>
-      </w:r>
-      <w:proofErr w:type="gramEnd"/>
-      <w:r>
-        <w:t xml:space="preserve"> dummy Tx/Rx frames and test the output.</w:t>
+        <w:t>If Loopback not possible then Add dummy Tx/Rx frames and test the output.</w:t>
       </w:r>
     </w:p>
     <w:p>
@@ -309,48 +299,34 @@
       <w:r>
         <w:t>Add dummy “</w:t>
       </w:r>
-      <w:proofErr w:type="spellStart"/>
       <w:r>
         <w:t>ethernetif.c</w:t>
       </w:r>
-      <w:proofErr w:type="spellEnd"/>
       <w:r>
         <w:t>” and “</w:t>
       </w:r>
-      <w:proofErr w:type="spellStart"/>
       <w:r>
         <w:t>ethernetif.</w:t>
       </w:r>
       <w:r>
-        <w:t>h</w:t>
-      </w:r>
-      <w:proofErr w:type="spellEnd"/>
-      <w:r>
-        <w:t>” file support and trace the calls to Tx/Rx functions.</w:t>
+        <w:t>h” file support and trace the calls to Tx/Rx functions.</w:t>
       </w:r>
     </w:p>
     <w:p>
       <w:r>
         <w:t>Implement “</w:t>
       </w:r>
-      <w:proofErr w:type="spellStart"/>
       <w:r>
         <w:t>ethernetif.c</w:t>
       </w:r>
-      <w:proofErr w:type="spellEnd"/>
       <w:r>
         <w:t>” and “</w:t>
       </w:r>
-      <w:proofErr w:type="spellStart"/>
       <w:r>
         <w:t>ethernetif.</w:t>
       </w:r>
       <w:r>
-        <w:t>h</w:t>
-      </w:r>
-      <w:proofErr w:type="spellEnd"/>
-      <w:r>
-        <w:t>” files for the LWIP for compatibility with ENC28J60 controller.</w:t>
+        <w:t>h” files for the LWIP for compatibility with ENC28J60 controller.</w:t>
       </w:r>
     </w:p>
     <w:p>
@@ -463,43 +439,17 @@
         <w:t xml:space="preserve"> with the </w:t>
       </w:r>
       <w:hyperlink r:id="rId6" w:tgtFrame="_blank" w:history="1">
-        <w:proofErr w:type="spellStart"/>
         <w:r>
           <w:rPr>
             <w:rStyle w:val="Hyperlink"/>
             <w:color w:val="auto"/>
             <w:u w:val="none"/>
           </w:rPr>
-          <w:t>lwIP</w:t>
-        </w:r>
-        <w:proofErr w:type="spellEnd"/>
-        <w:r>
-          <w:rPr>
-            <w:rStyle w:val="Hyperlink"/>
-            <w:color w:val="auto"/>
-            <w:u w:val="none"/>
-          </w:rPr>
-          <w:t xml:space="preserve"> (Lightweight IP)</w:t>
+          <w:t>lwIP (Lightweight IP)</w:t>
         </w:r>
       </w:hyperlink>
       <w:r>
-        <w:t xml:space="preserve"> stack on a microcontroller, you must interface your hardware SPI layer with </w:t>
-      </w:r>
-      <w:proofErr w:type="spellStart"/>
-      <w:r>
-        <w:t>lwIP's</w:t>
-      </w:r>
-      <w:proofErr w:type="spellEnd"/>
-      <w:r>
-        <w:t xml:space="preserve"> network interface layer (</w:t>
-      </w:r>
-      <w:proofErr w:type="spellStart"/>
-      <w:r>
-        <w:t>netif</w:t>
-      </w:r>
-      <w:proofErr w:type="spellEnd"/>
-      <w:r>
-        <w:t>). [</w:t>
+        <w:t xml:space="preserve"> stack on a microcontroller, you must interface your hardware SPI layer with lwIP's network interface layer (netif). [</w:t>
       </w:r>
       <w:hyperlink r:id="rId7" w:history="1">
         <w:r>
@@ -534,15 +484,7 @@
       </w:pPr>
       <w:r>
         <w:lastRenderedPageBreak/>
-        <w:t xml:space="preserve">Below is a complete, minimal framework for running </w:t>
-      </w:r>
-      <w:proofErr w:type="spellStart"/>
-      <w:r>
-        <w:t>lwIP</w:t>
-      </w:r>
-      <w:proofErr w:type="spellEnd"/>
-      <w:r>
-        <w:t xml:space="preserve"> in a bare-metal (NO_SYS = 1) configuration. [</w:t>
+        <w:t>Below is a complete, minimal framework for running lwIP in a bare-metal (NO_SYS = 1) configuration. [</w:t>
       </w:r>
       <w:hyperlink r:id="rId9" w:history="1">
         <w:r>
@@ -576,15 +518,7 @@
         <w:pStyle w:val="NoSpacing"/>
       </w:pPr>
       <w:r>
-        <w:t>Step 1: Configuration (</w:t>
-      </w:r>
-      <w:proofErr w:type="spellStart"/>
-      <w:r>
-        <w:t>lwipopts.h</w:t>
-      </w:r>
-      <w:proofErr w:type="spellEnd"/>
-      <w:r>
-        <w:t>)</w:t>
+        <w:t>Step 1: Configuration (lwipopts.h)</w:t>
       </w:r>
     </w:p>
     <w:p>
@@ -592,15 +526,7 @@
         <w:pStyle w:val="NoSpacing"/>
       </w:pPr>
       <w:r>
-        <w:t xml:space="preserve">This configuration file tells </w:t>
-      </w:r>
-      <w:proofErr w:type="spellStart"/>
-      <w:r>
-        <w:t>lwIP</w:t>
-      </w:r>
-      <w:proofErr w:type="spellEnd"/>
-      <w:r>
-        <w:t xml:space="preserve"> to run without an operating system layer (polling mode). [</w:t>
+        <w:t>This configuration file tells lwIP to run without an operating system layer (polling mode). [</w:t>
       </w:r>
       <w:hyperlink r:id="rId11" w:history="1">
         <w:r>
@@ -715,35 +641,7 @@
         <w:rPr>
           <w:rStyle w:val="SubtleEmphasis"/>
         </w:rPr>
-        <w:t xml:space="preserve">#define NO_SYS                  </w:t>
-      </w:r>
-      <w:proofErr w:type="gramStart"/>
-      <w:r>
-        <w:rPr>
-          <w:rStyle w:val="SubtleEmphasis"/>
-        </w:rPr>
-        <w:t>1  /</w:t>
-      </w:r>
-      <w:proofErr w:type="gramEnd"/>
-      <w:r>
-        <w:rPr>
-          <w:rStyle w:val="SubtleEmphasis"/>
-        </w:rPr>
-        <w:t xml:space="preserve">/ 1 = Bare-metal (No OS / No </w:t>
-      </w:r>
-      <w:proofErr w:type="spellStart"/>
-      <w:r>
-        <w:rPr>
-          <w:rStyle w:val="SubtleEmphasis"/>
-        </w:rPr>
-        <w:t>FreeRTOS</w:t>
-      </w:r>
-      <w:proofErr w:type="spellEnd"/>
-      <w:r>
-        <w:rPr>
-          <w:rStyle w:val="SubtleEmphasis"/>
-        </w:rPr>
-        <w:t>)</w:t>
+        <w:t>#define NO_SYS                  1  // 1 = Bare-metal (No OS / No FreeRTOS)</w:t>
       </w:r>
     </w:p>
     <w:p>
@@ -978,21 +876,7 @@
         <w:rPr>
           <w:rStyle w:val="SubtleEmphasis"/>
         </w:rPr>
-        <w:t xml:space="preserve">#define LWIP_DHCP               </w:t>
-      </w:r>
-      <w:proofErr w:type="gramStart"/>
-      <w:r>
-        <w:rPr>
-          <w:rStyle w:val="SubtleEmphasis"/>
-        </w:rPr>
-        <w:t>0  /</w:t>
-      </w:r>
-      <w:proofErr w:type="gramEnd"/>
-      <w:r>
-        <w:rPr>
-          <w:rStyle w:val="SubtleEmphasis"/>
-        </w:rPr>
-        <w:t>/ 0 = Static IP, 1 = DHCP</w:t>
+        <w:t>#define LWIP_DHCP               0  // 0 = Static IP, 1 = DHCP</w:t>
       </w:r>
     </w:p>
     <w:p>
@@ -1062,68 +946,26 @@
         <w:rPr>
           <w:rStyle w:val="SubtleEmphasis"/>
         </w:rPr>
-        <w:t>Step 2: The Network Interface Port (</w:t>
-      </w:r>
-      <w:proofErr w:type="spellStart"/>
-      <w:r>
-        <w:rPr>
-          <w:rStyle w:val="SubtleEmphasis"/>
-        </w:rPr>
-        <w:t>ethernetif.c</w:t>
-      </w:r>
-      <w:proofErr w:type="spellEnd"/>
-      <w:r>
-        <w:rPr>
-          <w:rStyle w:val="SubtleEmphasis"/>
-        </w:rPr>
-        <w:t>)</w:t>
-      </w:r>
-    </w:p>
-    <w:p>
-      <w:pPr>
-        <w:pStyle w:val="Heading1"/>
-        <w:numPr>
-          <w:ilvl w:val="0"/>
-          <w:numId w:val="0"/>
-        </w:numPr>
-        <w:ind w:left="720"/>
-        <w:rPr>
-          <w:rStyle w:val="SubtleEmphasis"/>
-        </w:rPr>
-      </w:pPr>
-      <w:r>
-        <w:rPr>
-          <w:rStyle w:val="SubtleEmphasis"/>
-        </w:rPr>
-        <w:t>This file links the low-level SPI functions of the ENC28J60 driver to the packet buffers (</w:t>
-      </w:r>
-      <w:proofErr w:type="spellStart"/>
-      <w:r>
-        <w:rPr>
-          <w:rStyle w:val="SubtleEmphasis"/>
-        </w:rPr>
-        <w:t>pbuf</w:t>
-      </w:r>
-      <w:proofErr w:type="spellEnd"/>
-      <w:r>
-        <w:rPr>
-          <w:rStyle w:val="SubtleEmphasis"/>
-        </w:rPr>
-        <w:t xml:space="preserve">) of the </w:t>
-      </w:r>
-      <w:proofErr w:type="spellStart"/>
-      <w:r>
-        <w:rPr>
-          <w:rStyle w:val="SubtleEmphasis"/>
-        </w:rPr>
-        <w:t>lwIP</w:t>
-      </w:r>
-      <w:proofErr w:type="spellEnd"/>
-      <w:r>
-        <w:rPr>
-          <w:rStyle w:val="SubtleEmphasis"/>
-        </w:rPr>
-        <w:t xml:space="preserve"> stack. [</w:t>
+        <w:t>Step 2: The Network Interface Port (ethernetif.c)</w:t>
+      </w:r>
+    </w:p>
+    <w:p>
+      <w:pPr>
+        <w:pStyle w:val="Heading1"/>
+        <w:numPr>
+          <w:ilvl w:val="0"/>
+          <w:numId w:val="0"/>
+        </w:numPr>
+        <w:ind w:left="720"/>
+        <w:rPr>
+          <w:rStyle w:val="SubtleEmphasis"/>
+        </w:rPr>
+      </w:pPr>
+      <w:r>
+        <w:rPr>
+          <w:rStyle w:val="SubtleEmphasis"/>
+        </w:rPr>
+        <w:t>This file links the low-level SPI functions of the ENC28J60 driver to the packet buffers (pbuf) of the lwIP stack. [</w:t>
       </w:r>
       <w:hyperlink r:id="rId13" w:history="1">
         <w:r>
@@ -1175,129 +1017,45 @@
         <w:rPr>
           <w:rStyle w:val="SubtleEmphasis"/>
         </w:rPr>
-        <w:t>#include "</w:t>
-      </w:r>
-      <w:proofErr w:type="spellStart"/>
-      <w:r>
-        <w:rPr>
-          <w:rStyle w:val="SubtleEmphasis"/>
-        </w:rPr>
-        <w:t>lwip</w:t>
-      </w:r>
-      <w:proofErr w:type="spellEnd"/>
-      <w:r>
-        <w:rPr>
-          <w:rStyle w:val="SubtleEmphasis"/>
-        </w:rPr>
-        <w:t>/</w:t>
-      </w:r>
-      <w:proofErr w:type="spellStart"/>
-      <w:r>
-        <w:rPr>
-          <w:rStyle w:val="SubtleEmphasis"/>
-        </w:rPr>
-        <w:t>netif.h</w:t>
-      </w:r>
-      <w:proofErr w:type="spellEnd"/>
-      <w:r>
-        <w:rPr>
-          <w:rStyle w:val="SubtleEmphasis"/>
-        </w:rPr>
-        <w:t>"</w:t>
-      </w:r>
-    </w:p>
-    <w:p>
-      <w:pPr>
-        <w:pStyle w:val="Heading1"/>
-        <w:numPr>
-          <w:ilvl w:val="0"/>
-          <w:numId w:val="0"/>
-        </w:numPr>
-        <w:ind w:left="720"/>
-        <w:rPr>
-          <w:rStyle w:val="SubtleEmphasis"/>
-        </w:rPr>
-      </w:pPr>
-      <w:r>
-        <w:rPr>
-          <w:rStyle w:val="SubtleEmphasis"/>
-        </w:rPr>
-        <w:t>#include "</w:t>
-      </w:r>
-      <w:proofErr w:type="spellStart"/>
-      <w:r>
-        <w:rPr>
-          <w:rStyle w:val="SubtleEmphasis"/>
-        </w:rPr>
-        <w:t>lwip</w:t>
-      </w:r>
-      <w:proofErr w:type="spellEnd"/>
-      <w:r>
-        <w:rPr>
-          <w:rStyle w:val="SubtleEmphasis"/>
-        </w:rPr>
-        <w:t>/</w:t>
-      </w:r>
-      <w:proofErr w:type="spellStart"/>
-      <w:r>
-        <w:rPr>
-          <w:rStyle w:val="SubtleEmphasis"/>
-        </w:rPr>
-        <w:t>pbuf.h</w:t>
-      </w:r>
-      <w:proofErr w:type="spellEnd"/>
-      <w:r>
-        <w:rPr>
-          <w:rStyle w:val="SubtleEmphasis"/>
-        </w:rPr>
-        <w:t>"</w:t>
-      </w:r>
-    </w:p>
-    <w:p>
-      <w:pPr>
-        <w:pStyle w:val="Heading1"/>
-        <w:numPr>
-          <w:ilvl w:val="0"/>
-          <w:numId w:val="0"/>
-        </w:numPr>
-        <w:ind w:left="720"/>
-        <w:rPr>
-          <w:rStyle w:val="SubtleEmphasis"/>
-        </w:rPr>
-      </w:pPr>
-      <w:r>
-        <w:rPr>
-          <w:rStyle w:val="SubtleEmphasis"/>
-        </w:rPr>
-        <w:t>#include "</w:t>
-      </w:r>
-      <w:proofErr w:type="spellStart"/>
-      <w:r>
-        <w:rPr>
-          <w:rStyle w:val="SubtleEmphasis"/>
-        </w:rPr>
-        <w:t>netif</w:t>
-      </w:r>
-      <w:proofErr w:type="spellEnd"/>
-      <w:r>
-        <w:rPr>
-          <w:rStyle w:val="SubtleEmphasis"/>
-        </w:rPr>
-        <w:t>/</w:t>
-      </w:r>
-      <w:proofErr w:type="spellStart"/>
-      <w:r>
-        <w:rPr>
-          <w:rStyle w:val="SubtleEmphasis"/>
-        </w:rPr>
-        <w:t>etharp.h</w:t>
-      </w:r>
-      <w:proofErr w:type="spellEnd"/>
-      <w:r>
-        <w:rPr>
-          <w:rStyle w:val="SubtleEmphasis"/>
-        </w:rPr>
-        <w:t>"</w:t>
+        <w:t>#include "lwip/netif.h"</w:t>
+      </w:r>
+    </w:p>
+    <w:p>
+      <w:pPr>
+        <w:pStyle w:val="Heading1"/>
+        <w:numPr>
+          <w:ilvl w:val="0"/>
+          <w:numId w:val="0"/>
+        </w:numPr>
+        <w:ind w:left="720"/>
+        <w:rPr>
+          <w:rStyle w:val="SubtleEmphasis"/>
+        </w:rPr>
+      </w:pPr>
+      <w:r>
+        <w:rPr>
+          <w:rStyle w:val="SubtleEmphasis"/>
+        </w:rPr>
+        <w:t>#include "lwip/pbuf.h"</w:t>
+      </w:r>
+    </w:p>
+    <w:p>
+      <w:pPr>
+        <w:pStyle w:val="Heading1"/>
+        <w:numPr>
+          <w:ilvl w:val="0"/>
+          <w:numId w:val="0"/>
+        </w:numPr>
+        <w:ind w:left="720"/>
+        <w:rPr>
+          <w:rStyle w:val="SubtleEmphasis"/>
+        </w:rPr>
+      </w:pPr>
+      <w:r>
+        <w:rPr>
+          <w:rStyle w:val="SubtleEmphasis"/>
+        </w:rPr>
+        <w:t>#include "netif/etharp.h"</w:t>
       </w:r>
     </w:p>
     <w:p>
@@ -1367,63 +1125,26 @@
         <w:rPr>
           <w:rStyle w:val="SubtleEmphasis"/>
         </w:rPr>
-        <w:t xml:space="preserve">static void </w:t>
-      </w:r>
-      <w:proofErr w:type="spellStart"/>
-      <w:r>
-        <w:rPr>
-          <w:rStyle w:val="SubtleEmphasis"/>
-        </w:rPr>
-        <w:t>low_level_</w:t>
-      </w:r>
-      <w:proofErr w:type="gramStart"/>
-      <w:r>
-        <w:rPr>
-          <w:rStyle w:val="SubtleEmphasis"/>
-        </w:rPr>
-        <w:t>init</w:t>
-      </w:r>
-      <w:proofErr w:type="spellEnd"/>
-      <w:r>
-        <w:rPr>
-          <w:rStyle w:val="SubtleEmphasis"/>
-        </w:rPr>
-        <w:t>(</w:t>
-      </w:r>
-      <w:proofErr w:type="gramEnd"/>
-      <w:r>
-        <w:rPr>
-          <w:rStyle w:val="SubtleEmphasis"/>
-        </w:rPr>
-        <w:t xml:space="preserve">struct </w:t>
-      </w:r>
-      <w:proofErr w:type="spellStart"/>
-      <w:r>
-        <w:rPr>
-          <w:rStyle w:val="SubtleEmphasis"/>
-        </w:rPr>
-        <w:t>netif</w:t>
-      </w:r>
-      <w:proofErr w:type="spellEnd"/>
-      <w:r>
-        <w:rPr>
-          <w:rStyle w:val="SubtleEmphasis"/>
-        </w:rPr>
-        <w:t xml:space="preserve"> *</w:t>
-      </w:r>
-      <w:proofErr w:type="spellStart"/>
-      <w:r>
-        <w:rPr>
-          <w:rStyle w:val="SubtleEmphasis"/>
-        </w:rPr>
-        <w:t>netif</w:t>
-      </w:r>
-      <w:proofErr w:type="spellEnd"/>
-      <w:r>
-        <w:rPr>
-          <w:rStyle w:val="SubtleEmphasis"/>
-        </w:rPr>
-        <w:t>) {</w:t>
+        <w:t>static void low_level_init(struct netif *netif) {</w:t>
+      </w:r>
+    </w:p>
+    <w:p>
+      <w:pPr>
+        <w:pStyle w:val="Heading1"/>
+        <w:numPr>
+          <w:ilvl w:val="0"/>
+          <w:numId w:val="0"/>
+        </w:numPr>
+        <w:ind w:left="720"/>
+        <w:rPr>
+          <w:rStyle w:val="SubtleEmphasis"/>
+        </w:rPr>
+      </w:pPr>
+      <w:r>
+        <w:rPr>
+          <w:rStyle w:val="SubtleEmphasis"/>
+        </w:rPr>
+        <w:t xml:space="preserve">    netif-&gt;hwaddr_len = ETHARP_HWADDR_LEN;</w:t>
       </w:r>
     </w:p>
     <w:p>
@@ -1444,33 +1165,81 @@
         </w:rPr>
         <w:t xml:space="preserve">    </w:t>
       </w:r>
-      <w:proofErr w:type="spellStart"/>
-      <w:r>
-        <w:rPr>
-          <w:rStyle w:val="SubtleEmphasis"/>
-        </w:rPr>
-        <w:t>netif</w:t>
-      </w:r>
-      <w:proofErr w:type="spellEnd"/>
-      <w:r>
-        <w:rPr>
-          <w:rStyle w:val="SubtleEmphasis"/>
-        </w:rPr>
-        <w:t>-&gt;</w:t>
-      </w:r>
-      <w:proofErr w:type="spellStart"/>
-      <w:r>
-        <w:rPr>
-          <w:rStyle w:val="SubtleEmphasis"/>
-        </w:rPr>
-        <w:t>hwaddr_len</w:t>
-      </w:r>
-      <w:proofErr w:type="spellEnd"/>
-      <w:r>
-        <w:rPr>
-          <w:rStyle w:val="SubtleEmphasis"/>
-        </w:rPr>
-        <w:t xml:space="preserve"> = ETHARP_HWADDR_LEN;</w:t>
+    </w:p>
+    <w:p>
+      <w:pPr>
+        <w:pStyle w:val="Heading1"/>
+        <w:numPr>
+          <w:ilvl w:val="0"/>
+          <w:numId w:val="0"/>
+        </w:numPr>
+        <w:ind w:left="720"/>
+        <w:rPr>
+          <w:rStyle w:val="SubtleEmphasis"/>
+        </w:rPr>
+      </w:pPr>
+      <w:r>
+        <w:rPr>
+          <w:rStyle w:val="SubtleEmphasis"/>
+        </w:rPr>
+        <w:t xml:space="preserve">    // Set MAC Address (e.g., 00:08:DC:00:00:01)</w:t>
+      </w:r>
+    </w:p>
+    <w:p>
+      <w:pPr>
+        <w:pStyle w:val="Heading1"/>
+        <w:numPr>
+          <w:ilvl w:val="0"/>
+          <w:numId w:val="0"/>
+        </w:numPr>
+        <w:ind w:left="720"/>
+        <w:rPr>
+          <w:rStyle w:val="SubtleEmphasis"/>
+        </w:rPr>
+      </w:pPr>
+      <w:r>
+        <w:rPr>
+          <w:rStyle w:val="SubtleEmphasis"/>
+        </w:rPr>
+        <w:t xml:space="preserve">    netif-&gt;hwaddr[0] = 0x00; netif-&gt;hwaddr[1] = 0x08;</w:t>
+      </w:r>
+    </w:p>
+    <w:p>
+      <w:pPr>
+        <w:pStyle w:val="Heading1"/>
+        <w:numPr>
+          <w:ilvl w:val="0"/>
+          <w:numId w:val="0"/>
+        </w:numPr>
+        <w:ind w:left="720"/>
+        <w:rPr>
+          <w:rStyle w:val="SubtleEmphasis"/>
+        </w:rPr>
+      </w:pPr>
+      <w:r>
+        <w:rPr>
+          <w:rStyle w:val="SubtleEmphasis"/>
+        </w:rPr>
+        <w:t xml:space="preserve">    netif-&gt;hwaddr[2] = 0xDC; netif-&gt;hwaddr[3] = 0x00;</w:t>
+      </w:r>
+    </w:p>
+    <w:p>
+      <w:pPr>
+        <w:pStyle w:val="Heading1"/>
+        <w:numPr>
+          <w:ilvl w:val="0"/>
+          <w:numId w:val="0"/>
+        </w:numPr>
+        <w:ind w:left="720"/>
+        <w:rPr>
+          <w:rStyle w:val="SubtleEmphasis"/>
+        </w:rPr>
+      </w:pPr>
+      <w:r>
+        <w:rPr>
+          <w:rStyle w:val="SubtleEmphasis"/>
+        </w:rPr>
+        <w:t xml:space="preserve">    netif-&gt;hwaddr[4] = 0x00; netif-&gt;hwaddr[5] = 0x01;</w:t>
       </w:r>
     </w:p>
     <w:p>
@@ -1508,467 +1277,58 @@
         <w:rPr>
           <w:rStyle w:val="SubtleEmphasis"/>
         </w:rPr>
-        <w:t xml:space="preserve">    // Set MAC Address (e.g., 00:</w:t>
-      </w:r>
-      <w:proofErr w:type="gramStart"/>
-      <w:r>
-        <w:rPr>
-          <w:rStyle w:val="SubtleEmphasis"/>
-        </w:rPr>
-        <w:t>08:DC</w:t>
-      </w:r>
-      <w:proofErr w:type="gramEnd"/>
-      <w:r>
-        <w:rPr>
-          <w:rStyle w:val="SubtleEmphasis"/>
-        </w:rPr>
-        <w:t>:00:00:01)</w:t>
-      </w:r>
-    </w:p>
-    <w:p>
-      <w:pPr>
-        <w:pStyle w:val="Heading1"/>
-        <w:numPr>
-          <w:ilvl w:val="0"/>
-          <w:numId w:val="0"/>
-        </w:numPr>
-        <w:ind w:left="720"/>
-        <w:rPr>
-          <w:rStyle w:val="SubtleEmphasis"/>
-        </w:rPr>
-      </w:pPr>
-      <w:r>
-        <w:rPr>
-          <w:rStyle w:val="SubtleEmphasis"/>
-        </w:rPr>
-        <w:t xml:space="preserve">    </w:t>
-      </w:r>
-      <w:proofErr w:type="spellStart"/>
-      <w:r>
-        <w:rPr>
-          <w:rStyle w:val="SubtleEmphasis"/>
-        </w:rPr>
-        <w:t>netif</w:t>
-      </w:r>
-      <w:proofErr w:type="spellEnd"/>
-      <w:r>
-        <w:rPr>
-          <w:rStyle w:val="SubtleEmphasis"/>
-        </w:rPr>
-        <w:t>-&gt;</w:t>
-      </w:r>
-      <w:proofErr w:type="spellStart"/>
-      <w:proofErr w:type="gramStart"/>
-      <w:r>
-        <w:rPr>
-          <w:rStyle w:val="SubtleEmphasis"/>
-        </w:rPr>
-        <w:t>hwaddr</w:t>
-      </w:r>
-      <w:proofErr w:type="spellEnd"/>
-      <w:r>
-        <w:rPr>
-          <w:rStyle w:val="SubtleEmphasis"/>
-        </w:rPr>
-        <w:t>[</w:t>
-      </w:r>
-      <w:proofErr w:type="gramEnd"/>
-      <w:r>
-        <w:rPr>
-          <w:rStyle w:val="SubtleEmphasis"/>
-        </w:rPr>
-        <w:t xml:space="preserve">0] = 0x00; </w:t>
-      </w:r>
-      <w:proofErr w:type="spellStart"/>
-      <w:r>
-        <w:rPr>
-          <w:rStyle w:val="SubtleEmphasis"/>
-        </w:rPr>
-        <w:t>netif</w:t>
-      </w:r>
-      <w:proofErr w:type="spellEnd"/>
-      <w:r>
-        <w:rPr>
-          <w:rStyle w:val="SubtleEmphasis"/>
-        </w:rPr>
-        <w:t>-&gt;</w:t>
-      </w:r>
-      <w:proofErr w:type="spellStart"/>
-      <w:proofErr w:type="gramStart"/>
-      <w:r>
-        <w:rPr>
-          <w:rStyle w:val="SubtleEmphasis"/>
-        </w:rPr>
-        <w:t>hwaddr</w:t>
-      </w:r>
-      <w:proofErr w:type="spellEnd"/>
-      <w:r>
-        <w:rPr>
-          <w:rStyle w:val="SubtleEmphasis"/>
-        </w:rPr>
-        <w:t>[</w:t>
-      </w:r>
-      <w:proofErr w:type="gramEnd"/>
-      <w:r>
-        <w:rPr>
-          <w:rStyle w:val="SubtleEmphasis"/>
-        </w:rPr>
-        <w:t>1] = 0x08;</w:t>
-      </w:r>
-    </w:p>
-    <w:p>
-      <w:pPr>
-        <w:pStyle w:val="Heading1"/>
-        <w:numPr>
-          <w:ilvl w:val="0"/>
-          <w:numId w:val="0"/>
-        </w:numPr>
-        <w:ind w:left="720"/>
-        <w:rPr>
-          <w:rStyle w:val="SubtleEmphasis"/>
-        </w:rPr>
-      </w:pPr>
-      <w:r>
-        <w:rPr>
-          <w:rStyle w:val="SubtleEmphasis"/>
-        </w:rPr>
-        <w:t xml:space="preserve">    </w:t>
-      </w:r>
-      <w:proofErr w:type="spellStart"/>
-      <w:r>
-        <w:rPr>
-          <w:rStyle w:val="SubtleEmphasis"/>
-        </w:rPr>
-        <w:t>netif</w:t>
-      </w:r>
-      <w:proofErr w:type="spellEnd"/>
-      <w:r>
-        <w:rPr>
-          <w:rStyle w:val="SubtleEmphasis"/>
-        </w:rPr>
-        <w:t>-&gt;</w:t>
-      </w:r>
-      <w:proofErr w:type="spellStart"/>
-      <w:proofErr w:type="gramStart"/>
-      <w:r>
-        <w:rPr>
-          <w:rStyle w:val="SubtleEmphasis"/>
-        </w:rPr>
-        <w:t>hwaddr</w:t>
-      </w:r>
-      <w:proofErr w:type="spellEnd"/>
-      <w:r>
-        <w:rPr>
-          <w:rStyle w:val="SubtleEmphasis"/>
-        </w:rPr>
-        <w:t>[</w:t>
-      </w:r>
-      <w:proofErr w:type="gramEnd"/>
-      <w:r>
-        <w:rPr>
-          <w:rStyle w:val="SubtleEmphasis"/>
-        </w:rPr>
-        <w:t xml:space="preserve">2] = 0xDC; </w:t>
-      </w:r>
-      <w:proofErr w:type="spellStart"/>
-      <w:r>
-        <w:rPr>
-          <w:rStyle w:val="SubtleEmphasis"/>
-        </w:rPr>
-        <w:t>netif</w:t>
-      </w:r>
-      <w:proofErr w:type="spellEnd"/>
-      <w:r>
-        <w:rPr>
-          <w:rStyle w:val="SubtleEmphasis"/>
-        </w:rPr>
-        <w:t>-&gt;</w:t>
-      </w:r>
-      <w:proofErr w:type="spellStart"/>
-      <w:proofErr w:type="gramStart"/>
-      <w:r>
-        <w:rPr>
-          <w:rStyle w:val="SubtleEmphasis"/>
-        </w:rPr>
-        <w:t>hwaddr</w:t>
-      </w:r>
-      <w:proofErr w:type="spellEnd"/>
-      <w:r>
-        <w:rPr>
-          <w:rStyle w:val="SubtleEmphasis"/>
-        </w:rPr>
-        <w:t>[</w:t>
-      </w:r>
-      <w:proofErr w:type="gramEnd"/>
-      <w:r>
-        <w:rPr>
-          <w:rStyle w:val="SubtleEmphasis"/>
-        </w:rPr>
-        <w:t>3] = 0x00;</w:t>
-      </w:r>
-    </w:p>
-    <w:p>
-      <w:pPr>
-        <w:pStyle w:val="Heading1"/>
-        <w:numPr>
-          <w:ilvl w:val="0"/>
-          <w:numId w:val="0"/>
-        </w:numPr>
-        <w:ind w:left="720"/>
-        <w:rPr>
-          <w:rStyle w:val="SubtleEmphasis"/>
-        </w:rPr>
-      </w:pPr>
-      <w:r>
-        <w:rPr>
-          <w:rStyle w:val="SubtleEmphasis"/>
-        </w:rPr>
-        <w:t xml:space="preserve">    </w:t>
-      </w:r>
-      <w:proofErr w:type="spellStart"/>
-      <w:r>
-        <w:rPr>
-          <w:rStyle w:val="SubtleEmphasis"/>
-        </w:rPr>
-        <w:t>netif</w:t>
-      </w:r>
-      <w:proofErr w:type="spellEnd"/>
-      <w:r>
-        <w:rPr>
-          <w:rStyle w:val="SubtleEmphasis"/>
-        </w:rPr>
-        <w:t>-&gt;</w:t>
-      </w:r>
-      <w:proofErr w:type="spellStart"/>
-      <w:proofErr w:type="gramStart"/>
-      <w:r>
-        <w:rPr>
-          <w:rStyle w:val="SubtleEmphasis"/>
-        </w:rPr>
-        <w:t>hwaddr</w:t>
-      </w:r>
-      <w:proofErr w:type="spellEnd"/>
-      <w:r>
-        <w:rPr>
-          <w:rStyle w:val="SubtleEmphasis"/>
-        </w:rPr>
-        <w:t>[</w:t>
-      </w:r>
-      <w:proofErr w:type="gramEnd"/>
-      <w:r>
-        <w:rPr>
-          <w:rStyle w:val="SubtleEmphasis"/>
-        </w:rPr>
-        <w:t xml:space="preserve">4] = 0x00; </w:t>
-      </w:r>
-      <w:proofErr w:type="spellStart"/>
-      <w:r>
-        <w:rPr>
-          <w:rStyle w:val="SubtleEmphasis"/>
-        </w:rPr>
-        <w:t>netif</w:t>
-      </w:r>
-      <w:proofErr w:type="spellEnd"/>
-      <w:r>
-        <w:rPr>
-          <w:rStyle w:val="SubtleEmphasis"/>
-        </w:rPr>
-        <w:t>-&gt;</w:t>
-      </w:r>
-      <w:proofErr w:type="spellStart"/>
-      <w:proofErr w:type="gramStart"/>
-      <w:r>
-        <w:rPr>
-          <w:rStyle w:val="SubtleEmphasis"/>
-        </w:rPr>
-        <w:t>hwaddr</w:t>
-      </w:r>
-      <w:proofErr w:type="spellEnd"/>
-      <w:r>
-        <w:rPr>
-          <w:rStyle w:val="SubtleEmphasis"/>
-        </w:rPr>
-        <w:t>[</w:t>
-      </w:r>
-      <w:proofErr w:type="gramEnd"/>
-      <w:r>
-        <w:rPr>
-          <w:rStyle w:val="SubtleEmphasis"/>
-        </w:rPr>
-        <w:t>5] = 0x01;</w:t>
-      </w:r>
-    </w:p>
-    <w:p>
-      <w:pPr>
-        <w:pStyle w:val="Heading1"/>
-        <w:numPr>
-          <w:ilvl w:val="0"/>
-          <w:numId w:val="0"/>
-        </w:numPr>
-        <w:ind w:left="720"/>
-        <w:rPr>
-          <w:rStyle w:val="SubtleEmphasis"/>
-        </w:rPr>
-      </w:pPr>
-      <w:r>
-        <w:rPr>
-          <w:rStyle w:val="SubtleEmphasis"/>
-        </w:rPr>
-        <w:t xml:space="preserve">    </w:t>
-      </w:r>
-    </w:p>
-    <w:p>
-      <w:pPr>
-        <w:pStyle w:val="Heading1"/>
-        <w:numPr>
-          <w:ilvl w:val="0"/>
-          <w:numId w:val="0"/>
-        </w:numPr>
-        <w:ind w:left="720"/>
-        <w:rPr>
-          <w:rStyle w:val="SubtleEmphasis"/>
-        </w:rPr>
-      </w:pPr>
-      <w:r>
-        <w:rPr>
-          <w:rStyle w:val="SubtleEmphasis"/>
-        </w:rPr>
-        <w:t xml:space="preserve">    </w:t>
-      </w:r>
-      <w:proofErr w:type="spellStart"/>
-      <w:r>
-        <w:rPr>
-          <w:rStyle w:val="SubtleEmphasis"/>
-        </w:rPr>
-        <w:t>netif</w:t>
-      </w:r>
-      <w:proofErr w:type="spellEnd"/>
-      <w:r>
-        <w:rPr>
-          <w:rStyle w:val="SubtleEmphasis"/>
-        </w:rPr>
-        <w:t>-&gt;</w:t>
-      </w:r>
-      <w:proofErr w:type="spellStart"/>
-      <w:r>
-        <w:rPr>
-          <w:rStyle w:val="SubtleEmphasis"/>
-        </w:rPr>
-        <w:t>mtu</w:t>
-      </w:r>
-      <w:proofErr w:type="spellEnd"/>
-      <w:r>
-        <w:rPr>
-          <w:rStyle w:val="SubtleEmphasis"/>
-        </w:rPr>
-        <w:t xml:space="preserve"> = 1500;</w:t>
-      </w:r>
-    </w:p>
-    <w:p>
-      <w:pPr>
-        <w:pStyle w:val="Heading1"/>
-        <w:numPr>
-          <w:ilvl w:val="0"/>
-          <w:numId w:val="0"/>
-        </w:numPr>
-        <w:ind w:left="720"/>
-        <w:rPr>
-          <w:rStyle w:val="SubtleEmphasis"/>
-        </w:rPr>
-      </w:pPr>
-      <w:r>
-        <w:rPr>
-          <w:rStyle w:val="SubtleEmphasis"/>
-        </w:rPr>
-        <w:t xml:space="preserve">    </w:t>
-      </w:r>
-      <w:proofErr w:type="spellStart"/>
-      <w:r>
-        <w:rPr>
-          <w:rStyle w:val="SubtleEmphasis"/>
-        </w:rPr>
-        <w:t>netif</w:t>
-      </w:r>
-      <w:proofErr w:type="spellEnd"/>
-      <w:r>
-        <w:rPr>
-          <w:rStyle w:val="SubtleEmphasis"/>
-        </w:rPr>
-        <w:t>-&gt;flags = NETIF_FLAG_BROADCAST | NETIF_FLAG_ETHARP | NETIF_FLAG_LINK_UP;</w:t>
-      </w:r>
-    </w:p>
-    <w:p>
-      <w:pPr>
-        <w:pStyle w:val="Heading1"/>
-        <w:numPr>
-          <w:ilvl w:val="0"/>
-          <w:numId w:val="0"/>
-        </w:numPr>
-        <w:ind w:left="720"/>
-        <w:rPr>
-          <w:rStyle w:val="SubtleEmphasis"/>
-        </w:rPr>
-      </w:pPr>
-    </w:p>
-    <w:p>
-      <w:pPr>
-        <w:pStyle w:val="Heading1"/>
-        <w:numPr>
-          <w:ilvl w:val="0"/>
-          <w:numId w:val="0"/>
-        </w:numPr>
-        <w:ind w:left="720"/>
-        <w:rPr>
-          <w:rStyle w:val="SubtleEmphasis"/>
-        </w:rPr>
-      </w:pPr>
-      <w:r>
-        <w:rPr>
-          <w:rStyle w:val="SubtleEmphasis"/>
-        </w:rPr>
-        <w:t xml:space="preserve">    ENC28J60_Init(</w:t>
-      </w:r>
-      <w:proofErr w:type="spellStart"/>
-      <w:r>
-        <w:rPr>
-          <w:rStyle w:val="SubtleEmphasis"/>
-        </w:rPr>
-        <w:t>netif</w:t>
-      </w:r>
-      <w:proofErr w:type="spellEnd"/>
-      <w:r>
-        <w:rPr>
-          <w:rStyle w:val="SubtleEmphasis"/>
-        </w:rPr>
-        <w:t>-&gt;</w:t>
-      </w:r>
-      <w:proofErr w:type="spellStart"/>
-      <w:r>
-        <w:rPr>
-          <w:rStyle w:val="SubtleEmphasis"/>
-        </w:rPr>
-        <w:t>hwaddr</w:t>
-      </w:r>
-      <w:proofErr w:type="spellEnd"/>
-      <w:r>
-        <w:rPr>
-          <w:rStyle w:val="SubtleEmphasis"/>
-        </w:rPr>
-        <w:t xml:space="preserve">); // Call your SPI physical layer </w:t>
-      </w:r>
-      <w:proofErr w:type="spellStart"/>
-      <w:r>
-        <w:rPr>
-          <w:rStyle w:val="SubtleEmphasis"/>
-        </w:rPr>
-        <w:t>init</w:t>
-      </w:r>
-      <w:proofErr w:type="spellEnd"/>
-      <w:r>
-        <w:rPr>
-          <w:rStyle w:val="SubtleEmphasis"/>
-        </w:rPr>
-        <w:t xml:space="preserve"> code</w:t>
+        <w:t xml:space="preserve">    netif-&gt;mtu = 1500;</w:t>
+      </w:r>
+    </w:p>
+    <w:p>
+      <w:pPr>
+        <w:pStyle w:val="Heading1"/>
+        <w:numPr>
+          <w:ilvl w:val="0"/>
+          <w:numId w:val="0"/>
+        </w:numPr>
+        <w:ind w:left="720"/>
+        <w:rPr>
+          <w:rStyle w:val="SubtleEmphasis"/>
+        </w:rPr>
+      </w:pPr>
+      <w:r>
+        <w:rPr>
+          <w:rStyle w:val="SubtleEmphasis"/>
+        </w:rPr>
+        <w:t xml:space="preserve">    netif-&gt;flags = NETIF_FLAG_BROADCAST | NETIF_FLAG_ETHARP | NETIF_FLAG_LINK_UP;</w:t>
+      </w:r>
+    </w:p>
+    <w:p>
+      <w:pPr>
+        <w:pStyle w:val="Heading1"/>
+        <w:numPr>
+          <w:ilvl w:val="0"/>
+          <w:numId w:val="0"/>
+        </w:numPr>
+        <w:ind w:left="720"/>
+        <w:rPr>
+          <w:rStyle w:val="SubtleEmphasis"/>
+        </w:rPr>
+      </w:pPr>
+    </w:p>
+    <w:p>
+      <w:pPr>
+        <w:pStyle w:val="Heading1"/>
+        <w:numPr>
+          <w:ilvl w:val="0"/>
+          <w:numId w:val="0"/>
+        </w:numPr>
+        <w:ind w:left="720"/>
+        <w:rPr>
+          <w:rStyle w:val="SubtleEmphasis"/>
+        </w:rPr>
+      </w:pPr>
+      <w:r>
+        <w:rPr>
+          <w:rStyle w:val="SubtleEmphasis"/>
+        </w:rPr>
+        <w:t xml:space="preserve">    ENC28J60_Init(netif-&gt;hwaddr); // Call your SPI physical layer init code</w:t>
       </w:r>
     </w:p>
     <w:p>
@@ -2039,217 +1399,77 @@
           <w:rStyle w:val="SubtleEmphasis"/>
         </w:rPr>
         <w:lastRenderedPageBreak/>
-        <w:t xml:space="preserve">static </w:t>
-      </w:r>
-      <w:proofErr w:type="spellStart"/>
-      <w:r>
-        <w:rPr>
-          <w:rStyle w:val="SubtleEmphasis"/>
-        </w:rPr>
-        <w:t>err_t</w:t>
-      </w:r>
-      <w:proofErr w:type="spellEnd"/>
-      <w:r>
-        <w:rPr>
-          <w:rStyle w:val="SubtleEmphasis"/>
-        </w:rPr>
-        <w:t xml:space="preserve"> </w:t>
-      </w:r>
-      <w:proofErr w:type="spellStart"/>
-      <w:r>
-        <w:rPr>
-          <w:rStyle w:val="SubtleEmphasis"/>
-        </w:rPr>
-        <w:t>low_level_</w:t>
-      </w:r>
-      <w:proofErr w:type="gramStart"/>
-      <w:r>
-        <w:rPr>
-          <w:rStyle w:val="SubtleEmphasis"/>
-        </w:rPr>
-        <w:t>output</w:t>
-      </w:r>
-      <w:proofErr w:type="spellEnd"/>
-      <w:r>
-        <w:rPr>
-          <w:rStyle w:val="SubtleEmphasis"/>
-        </w:rPr>
-        <w:t>(</w:t>
-      </w:r>
-      <w:proofErr w:type="gramEnd"/>
-      <w:r>
-        <w:rPr>
-          <w:rStyle w:val="SubtleEmphasis"/>
-        </w:rPr>
-        <w:t xml:space="preserve">struct </w:t>
-      </w:r>
-      <w:proofErr w:type="spellStart"/>
-      <w:r>
-        <w:rPr>
-          <w:rStyle w:val="SubtleEmphasis"/>
-        </w:rPr>
-        <w:t>netif</w:t>
-      </w:r>
-      <w:proofErr w:type="spellEnd"/>
-      <w:r>
-        <w:rPr>
-          <w:rStyle w:val="SubtleEmphasis"/>
-        </w:rPr>
-        <w:t xml:space="preserve"> *</w:t>
-      </w:r>
-      <w:proofErr w:type="spellStart"/>
-      <w:r>
-        <w:rPr>
-          <w:rStyle w:val="SubtleEmphasis"/>
-        </w:rPr>
-        <w:t>netif</w:t>
-      </w:r>
-      <w:proofErr w:type="spellEnd"/>
-      <w:r>
-        <w:rPr>
-          <w:rStyle w:val="SubtleEmphasis"/>
-        </w:rPr>
-        <w:t xml:space="preserve">, struct </w:t>
-      </w:r>
-      <w:proofErr w:type="spellStart"/>
-      <w:r>
-        <w:rPr>
-          <w:rStyle w:val="SubtleEmphasis"/>
-        </w:rPr>
-        <w:t>pbuf</w:t>
-      </w:r>
-      <w:proofErr w:type="spellEnd"/>
-      <w:r>
-        <w:rPr>
-          <w:rStyle w:val="SubtleEmphasis"/>
-        </w:rPr>
-        <w:t xml:space="preserve"> *p) {</w:t>
-      </w:r>
-    </w:p>
-    <w:p>
-      <w:pPr>
-        <w:pStyle w:val="Heading1"/>
-        <w:numPr>
-          <w:ilvl w:val="0"/>
-          <w:numId w:val="0"/>
-        </w:numPr>
-        <w:ind w:left="720"/>
-        <w:rPr>
-          <w:rStyle w:val="SubtleEmphasis"/>
-        </w:rPr>
-      </w:pPr>
-      <w:r>
-        <w:rPr>
-          <w:rStyle w:val="SubtleEmphasis"/>
-        </w:rPr>
-        <w:t xml:space="preserve">    struct </w:t>
-      </w:r>
-      <w:proofErr w:type="spellStart"/>
-      <w:r>
-        <w:rPr>
-          <w:rStyle w:val="SubtleEmphasis"/>
-        </w:rPr>
-        <w:t>pbuf</w:t>
-      </w:r>
-      <w:proofErr w:type="spellEnd"/>
-      <w:r>
-        <w:rPr>
-          <w:rStyle w:val="SubtleEmphasis"/>
-        </w:rPr>
-        <w:t xml:space="preserve"> *q;</w:t>
-      </w:r>
-    </w:p>
-    <w:p>
-      <w:pPr>
-        <w:pStyle w:val="Heading1"/>
-        <w:numPr>
-          <w:ilvl w:val="0"/>
-          <w:numId w:val="0"/>
-        </w:numPr>
-        <w:ind w:left="720"/>
-        <w:rPr>
-          <w:rStyle w:val="SubtleEmphasis"/>
-        </w:rPr>
-      </w:pPr>
-      <w:r>
-        <w:rPr>
-          <w:rStyle w:val="SubtleEmphasis"/>
-        </w:rPr>
-        <w:t xml:space="preserve">    ENC28J60_TransmitStart(p-&gt;</w:t>
-      </w:r>
-      <w:proofErr w:type="spellStart"/>
-      <w:r>
-        <w:rPr>
-          <w:rStyle w:val="SubtleEmphasis"/>
-        </w:rPr>
-        <w:t>tot_len</w:t>
-      </w:r>
-      <w:proofErr w:type="spellEnd"/>
-      <w:r>
-        <w:rPr>
-          <w:rStyle w:val="SubtleEmphasis"/>
-        </w:rPr>
-        <w:t>); // Alert ENC28J60 of oncoming payload</w:t>
-      </w:r>
-    </w:p>
-    <w:p>
-      <w:pPr>
-        <w:pStyle w:val="Heading1"/>
-        <w:numPr>
-          <w:ilvl w:val="0"/>
-          <w:numId w:val="0"/>
-        </w:numPr>
-        <w:ind w:left="720"/>
-        <w:rPr>
-          <w:rStyle w:val="SubtleEmphasis"/>
-        </w:rPr>
-      </w:pPr>
-    </w:p>
-    <w:p>
-      <w:pPr>
-        <w:pStyle w:val="Heading1"/>
-        <w:numPr>
-          <w:ilvl w:val="0"/>
-          <w:numId w:val="0"/>
-        </w:numPr>
-        <w:ind w:left="720"/>
-        <w:rPr>
-          <w:rStyle w:val="SubtleEmphasis"/>
-        </w:rPr>
-      </w:pPr>
-      <w:r>
-        <w:rPr>
-          <w:rStyle w:val="SubtleEmphasis"/>
-        </w:rPr>
-        <w:t xml:space="preserve">    </w:t>
-      </w:r>
-      <w:proofErr w:type="gramStart"/>
-      <w:r>
-        <w:rPr>
-          <w:rStyle w:val="SubtleEmphasis"/>
-        </w:rPr>
-        <w:t>for(</w:t>
-      </w:r>
-      <w:proofErr w:type="gramEnd"/>
-      <w:r>
-        <w:rPr>
-          <w:rStyle w:val="SubtleEmphasis"/>
-        </w:rPr>
-        <w:t xml:space="preserve">q = p; </w:t>
-      </w:r>
-      <w:proofErr w:type="gramStart"/>
-      <w:r>
-        <w:rPr>
-          <w:rStyle w:val="SubtleEmphasis"/>
-        </w:rPr>
-        <w:t>q !</w:t>
-      </w:r>
-      <w:proofErr w:type="gramEnd"/>
-      <w:r>
-        <w:rPr>
-          <w:rStyle w:val="SubtleEmphasis"/>
-        </w:rPr>
-        <w:t>= NULL; q = q-&gt;next) {</w:t>
+        <w:t>static err_t low_level_output(struct netif *netif, struct pbuf *p) {</w:t>
+      </w:r>
+    </w:p>
+    <w:p>
+      <w:pPr>
+        <w:pStyle w:val="Heading1"/>
+        <w:numPr>
+          <w:ilvl w:val="0"/>
+          <w:numId w:val="0"/>
+        </w:numPr>
+        <w:ind w:left="720"/>
+        <w:rPr>
+          <w:rStyle w:val="SubtleEmphasis"/>
+        </w:rPr>
+      </w:pPr>
+      <w:r>
+        <w:rPr>
+          <w:rStyle w:val="SubtleEmphasis"/>
+        </w:rPr>
+        <w:t xml:space="preserve">    struct pbuf *q;</w:t>
+      </w:r>
+    </w:p>
+    <w:p>
+      <w:pPr>
+        <w:pStyle w:val="Heading1"/>
+        <w:numPr>
+          <w:ilvl w:val="0"/>
+          <w:numId w:val="0"/>
+        </w:numPr>
+        <w:ind w:left="720"/>
+        <w:rPr>
+          <w:rStyle w:val="SubtleEmphasis"/>
+        </w:rPr>
+      </w:pPr>
+      <w:r>
+        <w:rPr>
+          <w:rStyle w:val="SubtleEmphasis"/>
+        </w:rPr>
+        <w:t xml:space="preserve">    ENC28J60_TransmitStart(p-&gt;tot_len); // Alert ENC28J60 of oncoming payload</w:t>
+      </w:r>
+    </w:p>
+    <w:p>
+      <w:pPr>
+        <w:pStyle w:val="Heading1"/>
+        <w:numPr>
+          <w:ilvl w:val="0"/>
+          <w:numId w:val="0"/>
+        </w:numPr>
+        <w:ind w:left="720"/>
+        <w:rPr>
+          <w:rStyle w:val="SubtleEmphasis"/>
+        </w:rPr>
+      </w:pPr>
+    </w:p>
+    <w:p>
+      <w:pPr>
+        <w:pStyle w:val="Heading1"/>
+        <w:numPr>
+          <w:ilvl w:val="0"/>
+          <w:numId w:val="0"/>
+        </w:numPr>
+        <w:ind w:left="720"/>
+        <w:rPr>
+          <w:rStyle w:val="SubtleEmphasis"/>
+        </w:rPr>
+      </w:pPr>
+      <w:r>
+        <w:rPr>
+          <w:rStyle w:val="SubtleEmphasis"/>
+        </w:rPr>
+        <w:t xml:space="preserve">    for(q = p; q != NULL; q = q-&gt;next) {</w:t>
       </w:r>
     </w:p>
     <w:p>
@@ -2287,21 +1507,7 @@
         <w:rPr>
           <w:rStyle w:val="SubtleEmphasis"/>
         </w:rPr>
-        <w:t xml:space="preserve">        ENC28J60_WriteBuffer(q-&gt;payload, q-&gt;</w:t>
-      </w:r>
-      <w:proofErr w:type="spellStart"/>
-      <w:r>
-        <w:rPr>
-          <w:rStyle w:val="SubtleEmphasis"/>
-        </w:rPr>
-        <w:t>len</w:t>
-      </w:r>
-      <w:proofErr w:type="spellEnd"/>
-      <w:r>
-        <w:rPr>
-          <w:rStyle w:val="SubtleEmphasis"/>
-        </w:rPr>
-        <w:t xml:space="preserve">); </w:t>
+        <w:t xml:space="preserve">        ENC28J60_WriteBuffer(q-&gt;payload, q-&gt;len); </w:t>
       </w:r>
     </w:p>
     <w:p>
@@ -2352,21 +1558,7 @@
         <w:rPr>
           <w:rStyle w:val="SubtleEmphasis"/>
         </w:rPr>
-        <w:t xml:space="preserve">    ENC28J60_</w:t>
-      </w:r>
-      <w:proofErr w:type="gramStart"/>
-      <w:r>
-        <w:rPr>
-          <w:rStyle w:val="SubtleEmphasis"/>
-        </w:rPr>
-        <w:t>TransmitSend(</w:t>
-      </w:r>
-      <w:proofErr w:type="gramEnd"/>
-      <w:r>
-        <w:rPr>
-          <w:rStyle w:val="SubtleEmphasis"/>
-        </w:rPr>
-        <w:t>); // Execute transmit command</w:t>
+        <w:t xml:space="preserve">    ENC28J60_TransmitSend(); // Execute transmit command</w:t>
       </w:r>
     </w:p>
     <w:p>
@@ -2455,423 +1647,185 @@
         <w:rPr>
           <w:rStyle w:val="SubtleEmphasis"/>
         </w:rPr>
-        <w:t xml:space="preserve">static </w:t>
-      </w:r>
-      <w:proofErr w:type="gramStart"/>
-      <w:r>
-        <w:rPr>
-          <w:rStyle w:val="SubtleEmphasis"/>
-        </w:rPr>
-        <w:t>struct</w:t>
-      </w:r>
-      <w:proofErr w:type="gramEnd"/>
-      <w:r>
-        <w:rPr>
-          <w:rStyle w:val="SubtleEmphasis"/>
-        </w:rPr>
-        <w:t xml:space="preserve"> </w:t>
-      </w:r>
-      <w:proofErr w:type="spellStart"/>
-      <w:r>
-        <w:rPr>
-          <w:rStyle w:val="SubtleEmphasis"/>
-        </w:rPr>
-        <w:t>pbuf</w:t>
-      </w:r>
-      <w:proofErr w:type="spellEnd"/>
-      <w:r>
-        <w:rPr>
-          <w:rStyle w:val="SubtleEmphasis"/>
-        </w:rPr>
-        <w:t xml:space="preserve">* </w:t>
-      </w:r>
-      <w:proofErr w:type="spellStart"/>
-      <w:r>
-        <w:rPr>
-          <w:rStyle w:val="SubtleEmphasis"/>
-        </w:rPr>
-        <w:t>low_level_</w:t>
-      </w:r>
-      <w:proofErr w:type="gramStart"/>
-      <w:r>
-        <w:rPr>
-          <w:rStyle w:val="SubtleEmphasis"/>
-        </w:rPr>
-        <w:t>input</w:t>
-      </w:r>
-      <w:proofErr w:type="spellEnd"/>
-      <w:r>
-        <w:rPr>
-          <w:rStyle w:val="SubtleEmphasis"/>
-        </w:rPr>
-        <w:t>(</w:t>
-      </w:r>
-      <w:proofErr w:type="gramEnd"/>
-      <w:r>
-        <w:rPr>
-          <w:rStyle w:val="SubtleEmphasis"/>
-        </w:rPr>
-        <w:t xml:space="preserve">struct </w:t>
-      </w:r>
-      <w:proofErr w:type="spellStart"/>
-      <w:r>
-        <w:rPr>
-          <w:rStyle w:val="SubtleEmphasis"/>
-        </w:rPr>
-        <w:t>netif</w:t>
-      </w:r>
-      <w:proofErr w:type="spellEnd"/>
-      <w:r>
-        <w:rPr>
-          <w:rStyle w:val="SubtleEmphasis"/>
-        </w:rPr>
-        <w:t xml:space="preserve"> *</w:t>
-      </w:r>
-      <w:proofErr w:type="spellStart"/>
-      <w:r>
-        <w:rPr>
-          <w:rStyle w:val="SubtleEmphasis"/>
-        </w:rPr>
-        <w:t>netif</w:t>
-      </w:r>
-      <w:proofErr w:type="spellEnd"/>
-      <w:r>
-        <w:rPr>
-          <w:rStyle w:val="SubtleEmphasis"/>
-        </w:rPr>
-        <w:t>) {</w:t>
-      </w:r>
-    </w:p>
-    <w:p>
-      <w:pPr>
-        <w:pStyle w:val="Heading1"/>
-        <w:numPr>
-          <w:ilvl w:val="0"/>
-          <w:numId w:val="0"/>
-        </w:numPr>
-        <w:ind w:left="720"/>
-        <w:rPr>
-          <w:rStyle w:val="SubtleEmphasis"/>
-        </w:rPr>
-      </w:pPr>
-      <w:r>
-        <w:rPr>
-          <w:rStyle w:val="SubtleEmphasis"/>
-        </w:rPr>
-        <w:t xml:space="preserve">    struct </w:t>
-      </w:r>
-      <w:proofErr w:type="spellStart"/>
-      <w:r>
-        <w:rPr>
-          <w:rStyle w:val="SubtleEmphasis"/>
-        </w:rPr>
-        <w:t>pbuf</w:t>
-      </w:r>
-      <w:proofErr w:type="spellEnd"/>
-      <w:r>
-        <w:rPr>
-          <w:rStyle w:val="SubtleEmphasis"/>
-        </w:rPr>
-        <w:t xml:space="preserve"> *p = NULL, *q;</w:t>
-      </w:r>
-    </w:p>
-    <w:p>
-      <w:pPr>
-        <w:pStyle w:val="Heading1"/>
-        <w:numPr>
-          <w:ilvl w:val="0"/>
-          <w:numId w:val="0"/>
-        </w:numPr>
-        <w:ind w:left="720"/>
-        <w:rPr>
-          <w:rStyle w:val="SubtleEmphasis"/>
-        </w:rPr>
-      </w:pPr>
-      <w:r>
-        <w:rPr>
-          <w:rStyle w:val="SubtleEmphasis"/>
-        </w:rPr>
-        <w:t xml:space="preserve">    uint16_t </w:t>
-      </w:r>
-      <w:proofErr w:type="spellStart"/>
-      <w:r>
-        <w:rPr>
-          <w:rStyle w:val="SubtleEmphasis"/>
-        </w:rPr>
-        <w:t>len</w:t>
-      </w:r>
-      <w:proofErr w:type="spellEnd"/>
-      <w:r>
-        <w:rPr>
-          <w:rStyle w:val="SubtleEmphasis"/>
-        </w:rPr>
-        <w:t xml:space="preserve"> = ENC28J60_</w:t>
-      </w:r>
-      <w:proofErr w:type="gramStart"/>
-      <w:r>
-        <w:rPr>
-          <w:rStyle w:val="SubtleEmphasis"/>
-        </w:rPr>
-        <w:t>GetReceivedPacketLength(</w:t>
-      </w:r>
-      <w:proofErr w:type="gramEnd"/>
-      <w:r>
-        <w:rPr>
-          <w:rStyle w:val="SubtleEmphasis"/>
-        </w:rPr>
-        <w:t>);</w:t>
-      </w:r>
-    </w:p>
-    <w:p>
-      <w:pPr>
-        <w:pStyle w:val="Heading1"/>
-        <w:numPr>
-          <w:ilvl w:val="0"/>
-          <w:numId w:val="0"/>
-        </w:numPr>
-        <w:ind w:left="720"/>
-        <w:rPr>
-          <w:rStyle w:val="SubtleEmphasis"/>
-        </w:rPr>
-      </w:pPr>
-    </w:p>
-    <w:p>
-      <w:pPr>
-        <w:pStyle w:val="Heading1"/>
-        <w:numPr>
-          <w:ilvl w:val="0"/>
-          <w:numId w:val="0"/>
-        </w:numPr>
-        <w:ind w:left="720"/>
-        <w:rPr>
-          <w:rStyle w:val="SubtleEmphasis"/>
-        </w:rPr>
-      </w:pPr>
-      <w:r>
-        <w:rPr>
-          <w:rStyle w:val="SubtleEmphasis"/>
-        </w:rPr>
-        <w:t xml:space="preserve">    if (</w:t>
-      </w:r>
-      <w:proofErr w:type="spellStart"/>
-      <w:r>
-        <w:rPr>
-          <w:rStyle w:val="SubtleEmphasis"/>
-        </w:rPr>
-        <w:t>len</w:t>
-      </w:r>
-      <w:proofErr w:type="spellEnd"/>
-      <w:r>
-        <w:rPr>
-          <w:rStyle w:val="SubtleEmphasis"/>
-        </w:rPr>
-        <w:t xml:space="preserve"> == 0) return NULL;</w:t>
-      </w:r>
-    </w:p>
-    <w:p>
-      <w:pPr>
-        <w:pStyle w:val="Heading1"/>
-        <w:numPr>
-          <w:ilvl w:val="0"/>
-          <w:numId w:val="0"/>
-        </w:numPr>
-        <w:ind w:left="720"/>
-        <w:rPr>
-          <w:rStyle w:val="SubtleEmphasis"/>
-        </w:rPr>
-      </w:pPr>
-    </w:p>
-    <w:p>
-      <w:pPr>
-        <w:pStyle w:val="Heading1"/>
-        <w:numPr>
-          <w:ilvl w:val="0"/>
-          <w:numId w:val="0"/>
-        </w:numPr>
-        <w:ind w:left="720"/>
-        <w:rPr>
-          <w:rStyle w:val="SubtleEmphasis"/>
-        </w:rPr>
-      </w:pPr>
-      <w:r>
-        <w:rPr>
-          <w:rStyle w:val="SubtleEmphasis"/>
-        </w:rPr>
-        <w:t xml:space="preserve">    // Allocate packet buffer memory inside </w:t>
-      </w:r>
-      <w:proofErr w:type="spellStart"/>
-      <w:r>
-        <w:rPr>
-          <w:rStyle w:val="SubtleEmphasis"/>
-        </w:rPr>
-        <w:t>lwIP</w:t>
-      </w:r>
-      <w:proofErr w:type="spellEnd"/>
-      <w:r>
-        <w:rPr>
-          <w:rStyle w:val="SubtleEmphasis"/>
-        </w:rPr>
-        <w:t xml:space="preserve"> heap</w:t>
-      </w:r>
-    </w:p>
-    <w:p>
-      <w:pPr>
-        <w:pStyle w:val="Heading1"/>
-        <w:numPr>
-          <w:ilvl w:val="0"/>
-          <w:numId w:val="0"/>
-        </w:numPr>
-        <w:ind w:left="720"/>
-        <w:rPr>
-          <w:rStyle w:val="SubtleEmphasis"/>
-        </w:rPr>
-      </w:pPr>
-      <w:r>
-        <w:rPr>
-          <w:rStyle w:val="SubtleEmphasis"/>
-        </w:rPr>
-        <w:t xml:space="preserve">    p = </w:t>
-      </w:r>
-      <w:proofErr w:type="spellStart"/>
-      <w:r>
-        <w:rPr>
-          <w:rStyle w:val="SubtleEmphasis"/>
-        </w:rPr>
-        <w:t>pbuf_</w:t>
-      </w:r>
-      <w:proofErr w:type="gramStart"/>
-      <w:r>
-        <w:rPr>
-          <w:rStyle w:val="SubtleEmphasis"/>
-        </w:rPr>
-        <w:t>alloc</w:t>
-      </w:r>
-      <w:proofErr w:type="spellEnd"/>
-      <w:r>
-        <w:rPr>
-          <w:rStyle w:val="SubtleEmphasis"/>
-        </w:rPr>
-        <w:t>(</w:t>
-      </w:r>
-      <w:proofErr w:type="gramEnd"/>
-      <w:r>
-        <w:rPr>
-          <w:rStyle w:val="SubtleEmphasis"/>
-        </w:rPr>
-        <w:t xml:space="preserve">PBUF_RAW, </w:t>
-      </w:r>
-      <w:proofErr w:type="spellStart"/>
-      <w:r>
-        <w:rPr>
-          <w:rStyle w:val="SubtleEmphasis"/>
-        </w:rPr>
-        <w:t>len</w:t>
-      </w:r>
-      <w:proofErr w:type="spellEnd"/>
-      <w:r>
-        <w:rPr>
-          <w:rStyle w:val="SubtleEmphasis"/>
-        </w:rPr>
-        <w:t>, PBUF_POOL);</w:t>
-      </w:r>
-    </w:p>
-    <w:p>
-      <w:pPr>
-        <w:pStyle w:val="Heading1"/>
-        <w:numPr>
-          <w:ilvl w:val="0"/>
-          <w:numId w:val="0"/>
-        </w:numPr>
-        <w:ind w:left="720"/>
-        <w:rPr>
-          <w:rStyle w:val="SubtleEmphasis"/>
-        </w:rPr>
-      </w:pPr>
-      <w:r>
-        <w:rPr>
-          <w:rStyle w:val="SubtleEmphasis"/>
-        </w:rPr>
-        <w:t xml:space="preserve">    if (</w:t>
-      </w:r>
-      <w:proofErr w:type="gramStart"/>
-      <w:r>
-        <w:rPr>
-          <w:rStyle w:val="SubtleEmphasis"/>
-        </w:rPr>
-        <w:t>p !</w:t>
-      </w:r>
-      <w:proofErr w:type="gramEnd"/>
-      <w:r>
-        <w:rPr>
-          <w:rStyle w:val="SubtleEmphasis"/>
-        </w:rPr>
-        <w:t>= NULL) {</w:t>
-      </w:r>
-    </w:p>
-    <w:p>
-      <w:pPr>
-        <w:pStyle w:val="Heading1"/>
-        <w:numPr>
-          <w:ilvl w:val="0"/>
-          <w:numId w:val="0"/>
-        </w:numPr>
-        <w:ind w:left="720"/>
-        <w:rPr>
-          <w:rStyle w:val="SubtleEmphasis"/>
-        </w:rPr>
-      </w:pPr>
-      <w:r>
-        <w:rPr>
-          <w:rStyle w:val="SubtleEmphasis"/>
-        </w:rPr>
-        <w:t xml:space="preserve">        for (q = p; </w:t>
-      </w:r>
-      <w:proofErr w:type="gramStart"/>
-      <w:r>
-        <w:rPr>
-          <w:rStyle w:val="SubtleEmphasis"/>
-        </w:rPr>
-        <w:t>q !</w:t>
-      </w:r>
-      <w:proofErr w:type="gramEnd"/>
-      <w:r>
-        <w:rPr>
-          <w:rStyle w:val="SubtleEmphasis"/>
-        </w:rPr>
-        <w:t>= NULL; q = q-&gt;next) {</w:t>
-      </w:r>
-    </w:p>
-    <w:p>
-      <w:pPr>
-        <w:pStyle w:val="Heading1"/>
-        <w:numPr>
-          <w:ilvl w:val="0"/>
-          <w:numId w:val="0"/>
-        </w:numPr>
-        <w:ind w:left="720"/>
-        <w:rPr>
-          <w:rStyle w:val="SubtleEmphasis"/>
-        </w:rPr>
-      </w:pPr>
-      <w:r>
-        <w:rPr>
-          <w:rStyle w:val="SubtleEmphasis"/>
-        </w:rPr>
-        <w:t xml:space="preserve">            ENC28J60_ReadBuffer(q-&gt;payload, q-&gt;</w:t>
-      </w:r>
-      <w:proofErr w:type="spellStart"/>
-      <w:r>
-        <w:rPr>
-          <w:rStyle w:val="SubtleEmphasis"/>
-        </w:rPr>
-        <w:t>len</w:t>
-      </w:r>
-      <w:proofErr w:type="spellEnd"/>
-      <w:r>
-        <w:rPr>
-          <w:rStyle w:val="SubtleEmphasis"/>
-        </w:rPr>
-        <w:t>); // Read chunk via SPI</w:t>
+        <w:t>static struct pbuf* low_level_input(struct netif *netif) {</w:t>
+      </w:r>
+    </w:p>
+    <w:p>
+      <w:pPr>
+        <w:pStyle w:val="Heading1"/>
+        <w:numPr>
+          <w:ilvl w:val="0"/>
+          <w:numId w:val="0"/>
+        </w:numPr>
+        <w:ind w:left="720"/>
+        <w:rPr>
+          <w:rStyle w:val="SubtleEmphasis"/>
+        </w:rPr>
+      </w:pPr>
+      <w:r>
+        <w:rPr>
+          <w:rStyle w:val="SubtleEmphasis"/>
+        </w:rPr>
+        <w:t xml:space="preserve">    struct pbuf *p = NULL, *q;</w:t>
+      </w:r>
+    </w:p>
+    <w:p>
+      <w:pPr>
+        <w:pStyle w:val="Heading1"/>
+        <w:numPr>
+          <w:ilvl w:val="0"/>
+          <w:numId w:val="0"/>
+        </w:numPr>
+        <w:ind w:left="720"/>
+        <w:rPr>
+          <w:rStyle w:val="SubtleEmphasis"/>
+        </w:rPr>
+      </w:pPr>
+      <w:r>
+        <w:rPr>
+          <w:rStyle w:val="SubtleEmphasis"/>
+        </w:rPr>
+        <w:t xml:space="preserve">    uint16_t len = ENC28J60_GetReceivedPacketLength();</w:t>
+      </w:r>
+    </w:p>
+    <w:p>
+      <w:pPr>
+        <w:pStyle w:val="Heading1"/>
+        <w:numPr>
+          <w:ilvl w:val="0"/>
+          <w:numId w:val="0"/>
+        </w:numPr>
+        <w:ind w:left="720"/>
+        <w:rPr>
+          <w:rStyle w:val="SubtleEmphasis"/>
+        </w:rPr>
+      </w:pPr>
+    </w:p>
+    <w:p>
+      <w:pPr>
+        <w:pStyle w:val="Heading1"/>
+        <w:numPr>
+          <w:ilvl w:val="0"/>
+          <w:numId w:val="0"/>
+        </w:numPr>
+        <w:ind w:left="720"/>
+        <w:rPr>
+          <w:rStyle w:val="SubtleEmphasis"/>
+        </w:rPr>
+      </w:pPr>
+      <w:r>
+        <w:rPr>
+          <w:rStyle w:val="SubtleEmphasis"/>
+        </w:rPr>
+        <w:t xml:space="preserve">    if (len == 0) return NULL;</w:t>
+      </w:r>
+    </w:p>
+    <w:p>
+      <w:pPr>
+        <w:pStyle w:val="Heading1"/>
+        <w:numPr>
+          <w:ilvl w:val="0"/>
+          <w:numId w:val="0"/>
+        </w:numPr>
+        <w:ind w:left="720"/>
+        <w:rPr>
+          <w:rStyle w:val="SubtleEmphasis"/>
+        </w:rPr>
+      </w:pPr>
+    </w:p>
+    <w:p>
+      <w:pPr>
+        <w:pStyle w:val="Heading1"/>
+        <w:numPr>
+          <w:ilvl w:val="0"/>
+          <w:numId w:val="0"/>
+        </w:numPr>
+        <w:ind w:left="720"/>
+        <w:rPr>
+          <w:rStyle w:val="SubtleEmphasis"/>
+        </w:rPr>
+      </w:pPr>
+      <w:r>
+        <w:rPr>
+          <w:rStyle w:val="SubtleEmphasis"/>
+        </w:rPr>
+        <w:t xml:space="preserve">    // Allocate packet buffer memory inside lwIP heap</w:t>
+      </w:r>
+    </w:p>
+    <w:p>
+      <w:pPr>
+        <w:pStyle w:val="Heading1"/>
+        <w:numPr>
+          <w:ilvl w:val="0"/>
+          <w:numId w:val="0"/>
+        </w:numPr>
+        <w:ind w:left="720"/>
+        <w:rPr>
+          <w:rStyle w:val="SubtleEmphasis"/>
+        </w:rPr>
+      </w:pPr>
+      <w:r>
+        <w:rPr>
+          <w:rStyle w:val="SubtleEmphasis"/>
+        </w:rPr>
+        <w:t xml:space="preserve">    p = pbuf_alloc(PBUF_RAW, len, PBUF_POOL);</w:t>
+      </w:r>
+    </w:p>
+    <w:p>
+      <w:pPr>
+        <w:pStyle w:val="Heading1"/>
+        <w:numPr>
+          <w:ilvl w:val="0"/>
+          <w:numId w:val="0"/>
+        </w:numPr>
+        <w:ind w:left="720"/>
+        <w:rPr>
+          <w:rStyle w:val="SubtleEmphasis"/>
+        </w:rPr>
+      </w:pPr>
+      <w:r>
+        <w:rPr>
+          <w:rStyle w:val="SubtleEmphasis"/>
+        </w:rPr>
+        <w:t xml:space="preserve">    if (p != NULL) {</w:t>
+      </w:r>
+    </w:p>
+    <w:p>
+      <w:pPr>
+        <w:pStyle w:val="Heading1"/>
+        <w:numPr>
+          <w:ilvl w:val="0"/>
+          <w:numId w:val="0"/>
+        </w:numPr>
+        <w:ind w:left="720"/>
+        <w:rPr>
+          <w:rStyle w:val="SubtleEmphasis"/>
+        </w:rPr>
+      </w:pPr>
+      <w:r>
+        <w:rPr>
+          <w:rStyle w:val="SubtleEmphasis"/>
+        </w:rPr>
+        <w:t xml:space="preserve">        for (q = p; q != NULL; q = q-&gt;next) {</w:t>
+      </w:r>
+    </w:p>
+    <w:p>
+      <w:pPr>
+        <w:pStyle w:val="Heading1"/>
+        <w:numPr>
+          <w:ilvl w:val="0"/>
+          <w:numId w:val="0"/>
+        </w:numPr>
+        <w:ind w:left="720"/>
+        <w:rPr>
+          <w:rStyle w:val="SubtleEmphasis"/>
+        </w:rPr>
+      </w:pPr>
+      <w:r>
+        <w:rPr>
+          <w:rStyle w:val="SubtleEmphasis"/>
+        </w:rPr>
+        <w:t xml:space="preserve">            ENC28J60_ReadBuffer(q-&gt;payload, q-&gt;len); // Read chunk via SPI</w:t>
       </w:r>
     </w:p>
     <w:p>
@@ -2909,21 +1863,7 @@
         <w:rPr>
           <w:rStyle w:val="SubtleEmphasis"/>
         </w:rPr>
-        <w:t xml:space="preserve">        ENC28J60_</w:t>
-      </w:r>
-      <w:proofErr w:type="gramStart"/>
-      <w:r>
-        <w:rPr>
-          <w:rStyle w:val="SubtleEmphasis"/>
-        </w:rPr>
-        <w:t>FreeRxBuffer(</w:t>
-      </w:r>
-      <w:proofErr w:type="gramEnd"/>
-      <w:r>
-        <w:rPr>
-          <w:rStyle w:val="SubtleEmphasis"/>
-        </w:rPr>
-        <w:t>); // Clear ENC28J60 RX memory slot</w:t>
+        <w:t xml:space="preserve">        ENC28J60_FreeRxBuffer(); // Clear ENC28J60 RX memory slot</w:t>
       </w:r>
     </w:p>
     <w:p>
@@ -3012,352 +1952,134 @@
         <w:rPr>
           <w:rStyle w:val="SubtleEmphasis"/>
         </w:rPr>
-        <w:t xml:space="preserve">/* Initialization callback handled by </w:t>
-      </w:r>
-      <w:proofErr w:type="spellStart"/>
-      <w:r>
-        <w:rPr>
-          <w:rStyle w:val="SubtleEmphasis"/>
-        </w:rPr>
-        <w:t>lwIP</w:t>
-      </w:r>
-      <w:proofErr w:type="spellEnd"/>
-      <w:r>
-        <w:rPr>
-          <w:rStyle w:val="SubtleEmphasis"/>
-        </w:rPr>
-        <w:t xml:space="preserve"> */</w:t>
-      </w:r>
-    </w:p>
-    <w:p>
-      <w:pPr>
-        <w:pStyle w:val="Heading1"/>
-        <w:numPr>
-          <w:ilvl w:val="0"/>
-          <w:numId w:val="0"/>
-        </w:numPr>
-        <w:ind w:left="720"/>
-        <w:rPr>
-          <w:rStyle w:val="SubtleEmphasis"/>
-        </w:rPr>
-      </w:pPr>
-      <w:proofErr w:type="spellStart"/>
-      <w:r>
-        <w:rPr>
-          <w:rStyle w:val="SubtleEmphasis"/>
-        </w:rPr>
-        <w:t>err_t</w:t>
-      </w:r>
-      <w:proofErr w:type="spellEnd"/>
-      <w:r>
-        <w:rPr>
-          <w:rStyle w:val="SubtleEmphasis"/>
-        </w:rPr>
-        <w:t xml:space="preserve"> enc28j60_netif_</w:t>
-      </w:r>
-      <w:proofErr w:type="gramStart"/>
-      <w:r>
-        <w:rPr>
-          <w:rStyle w:val="SubtleEmphasis"/>
-        </w:rPr>
-        <w:t>init(</w:t>
-      </w:r>
-      <w:proofErr w:type="gramEnd"/>
-      <w:r>
-        <w:rPr>
-          <w:rStyle w:val="SubtleEmphasis"/>
-        </w:rPr>
-        <w:t xml:space="preserve">struct </w:t>
-      </w:r>
-      <w:proofErr w:type="spellStart"/>
-      <w:r>
-        <w:rPr>
-          <w:rStyle w:val="SubtleEmphasis"/>
-        </w:rPr>
-        <w:t>netif</w:t>
-      </w:r>
-      <w:proofErr w:type="spellEnd"/>
-      <w:r>
-        <w:rPr>
-          <w:rStyle w:val="SubtleEmphasis"/>
-        </w:rPr>
-        <w:t xml:space="preserve"> *</w:t>
-      </w:r>
-      <w:proofErr w:type="spellStart"/>
-      <w:r>
-        <w:rPr>
-          <w:rStyle w:val="SubtleEmphasis"/>
-        </w:rPr>
-        <w:t>netif</w:t>
-      </w:r>
-      <w:proofErr w:type="spellEnd"/>
-      <w:r>
-        <w:rPr>
-          <w:rStyle w:val="SubtleEmphasis"/>
-        </w:rPr>
-        <w:t>) {</w:t>
-      </w:r>
-    </w:p>
-    <w:p>
-      <w:pPr>
-        <w:pStyle w:val="Heading1"/>
-        <w:numPr>
-          <w:ilvl w:val="0"/>
-          <w:numId w:val="0"/>
-        </w:numPr>
-        <w:ind w:left="720"/>
-        <w:rPr>
-          <w:rStyle w:val="SubtleEmphasis"/>
-        </w:rPr>
-      </w:pPr>
-      <w:r>
-        <w:rPr>
-          <w:rStyle w:val="SubtleEmphasis"/>
-        </w:rPr>
-        <w:t xml:space="preserve">    </w:t>
-      </w:r>
-      <w:proofErr w:type="spellStart"/>
-      <w:r>
-        <w:rPr>
-          <w:rStyle w:val="SubtleEmphasis"/>
-        </w:rPr>
-        <w:t>netif</w:t>
-      </w:r>
-      <w:proofErr w:type="spellEnd"/>
-      <w:r>
-        <w:rPr>
-          <w:rStyle w:val="SubtleEmphasis"/>
-        </w:rPr>
-        <w:t>-&gt;</w:t>
-      </w:r>
-      <w:proofErr w:type="gramStart"/>
-      <w:r>
-        <w:rPr>
-          <w:rStyle w:val="SubtleEmphasis"/>
-        </w:rPr>
-        <w:t>name[</w:t>
-      </w:r>
-      <w:proofErr w:type="gramEnd"/>
-      <w:r>
-        <w:rPr>
-          <w:rStyle w:val="SubtleEmphasis"/>
-        </w:rPr>
-        <w:t>0] = 'e';</w:t>
-      </w:r>
-    </w:p>
-    <w:p>
-      <w:pPr>
-        <w:pStyle w:val="Heading1"/>
-        <w:numPr>
-          <w:ilvl w:val="0"/>
-          <w:numId w:val="0"/>
-        </w:numPr>
-        <w:ind w:left="720"/>
-        <w:rPr>
-          <w:rStyle w:val="SubtleEmphasis"/>
-        </w:rPr>
-      </w:pPr>
-      <w:r>
-        <w:rPr>
-          <w:rStyle w:val="SubtleEmphasis"/>
-        </w:rPr>
-        <w:t xml:space="preserve">    </w:t>
-      </w:r>
-      <w:proofErr w:type="spellStart"/>
-      <w:r>
-        <w:rPr>
-          <w:rStyle w:val="SubtleEmphasis"/>
-        </w:rPr>
-        <w:t>netif</w:t>
-      </w:r>
-      <w:proofErr w:type="spellEnd"/>
-      <w:r>
-        <w:rPr>
-          <w:rStyle w:val="SubtleEmphasis"/>
-        </w:rPr>
-        <w:t>-&gt;</w:t>
-      </w:r>
-      <w:proofErr w:type="gramStart"/>
-      <w:r>
-        <w:rPr>
-          <w:rStyle w:val="SubtleEmphasis"/>
-        </w:rPr>
-        <w:t>name[</w:t>
-      </w:r>
-      <w:proofErr w:type="gramEnd"/>
-      <w:r>
-        <w:rPr>
-          <w:rStyle w:val="SubtleEmphasis"/>
-        </w:rPr>
-        <w:t>1] = 'n';</w:t>
-      </w:r>
-    </w:p>
-    <w:p>
-      <w:pPr>
-        <w:pStyle w:val="Heading1"/>
-        <w:numPr>
-          <w:ilvl w:val="0"/>
-          <w:numId w:val="0"/>
-        </w:numPr>
-        <w:ind w:left="720"/>
-        <w:rPr>
-          <w:rStyle w:val="SubtleEmphasis"/>
-        </w:rPr>
-      </w:pPr>
-      <w:r>
-        <w:rPr>
-          <w:rStyle w:val="SubtleEmphasis"/>
-        </w:rPr>
-        <w:t xml:space="preserve">    </w:t>
-      </w:r>
-      <w:proofErr w:type="spellStart"/>
-      <w:r>
-        <w:rPr>
-          <w:rStyle w:val="SubtleEmphasis"/>
-        </w:rPr>
-        <w:t>netif</w:t>
-      </w:r>
-      <w:proofErr w:type="spellEnd"/>
-      <w:r>
-        <w:rPr>
-          <w:rStyle w:val="SubtleEmphasis"/>
-        </w:rPr>
-        <w:t xml:space="preserve">-&gt;output = </w:t>
-      </w:r>
-      <w:proofErr w:type="spellStart"/>
-      <w:r>
-        <w:rPr>
-          <w:rStyle w:val="SubtleEmphasis"/>
-        </w:rPr>
-        <w:t>etharp_output</w:t>
-      </w:r>
-      <w:proofErr w:type="spellEnd"/>
-      <w:r>
-        <w:rPr>
-          <w:rStyle w:val="SubtleEmphasis"/>
-        </w:rPr>
-        <w:t>; // Assigns the ARP handler</w:t>
-      </w:r>
-    </w:p>
-    <w:p>
-      <w:pPr>
-        <w:pStyle w:val="Heading1"/>
-        <w:numPr>
-          <w:ilvl w:val="0"/>
-          <w:numId w:val="0"/>
-        </w:numPr>
-        <w:ind w:left="720"/>
-        <w:rPr>
-          <w:rStyle w:val="SubtleEmphasis"/>
-        </w:rPr>
-      </w:pPr>
-      <w:r>
-        <w:rPr>
-          <w:rStyle w:val="SubtleEmphasis"/>
-        </w:rPr>
-        <w:t xml:space="preserve">    </w:t>
-      </w:r>
-      <w:proofErr w:type="spellStart"/>
-      <w:r>
-        <w:rPr>
-          <w:rStyle w:val="SubtleEmphasis"/>
-        </w:rPr>
-        <w:t>netif</w:t>
-      </w:r>
-      <w:proofErr w:type="spellEnd"/>
-      <w:r>
-        <w:rPr>
-          <w:rStyle w:val="SubtleEmphasis"/>
-        </w:rPr>
-        <w:t>-&gt;</w:t>
-      </w:r>
-      <w:proofErr w:type="spellStart"/>
-      <w:r>
-        <w:rPr>
-          <w:rStyle w:val="SubtleEmphasis"/>
-        </w:rPr>
-        <w:t>linkoutput</w:t>
-      </w:r>
-      <w:proofErr w:type="spellEnd"/>
-      <w:r>
-        <w:rPr>
-          <w:rStyle w:val="SubtleEmphasis"/>
-        </w:rPr>
-        <w:t xml:space="preserve"> = </w:t>
-      </w:r>
-      <w:proofErr w:type="spellStart"/>
-      <w:r>
-        <w:rPr>
-          <w:rStyle w:val="SubtleEmphasis"/>
-        </w:rPr>
-        <w:t>low_level_output</w:t>
-      </w:r>
-      <w:proofErr w:type="spellEnd"/>
-      <w:r>
-        <w:rPr>
-          <w:rStyle w:val="SubtleEmphasis"/>
-        </w:rPr>
-        <w:t>;</w:t>
-      </w:r>
-    </w:p>
-    <w:p>
-      <w:pPr>
-        <w:pStyle w:val="Heading1"/>
-        <w:numPr>
-          <w:ilvl w:val="0"/>
-          <w:numId w:val="0"/>
-        </w:numPr>
-        <w:ind w:left="720"/>
-        <w:rPr>
-          <w:rStyle w:val="SubtleEmphasis"/>
-        </w:rPr>
-      </w:pPr>
-    </w:p>
-    <w:p>
-      <w:pPr>
-        <w:pStyle w:val="Heading1"/>
-        <w:numPr>
-          <w:ilvl w:val="0"/>
-          <w:numId w:val="0"/>
-        </w:numPr>
-        <w:ind w:left="720"/>
-        <w:rPr>
-          <w:rStyle w:val="SubtleEmphasis"/>
-        </w:rPr>
-      </w:pPr>
-      <w:r>
-        <w:rPr>
-          <w:rStyle w:val="SubtleEmphasis"/>
-        </w:rPr>
-        <w:t xml:space="preserve">    </w:t>
-      </w:r>
-      <w:proofErr w:type="spellStart"/>
-      <w:r>
-        <w:rPr>
-          <w:rStyle w:val="SubtleEmphasis"/>
-        </w:rPr>
-        <w:t>low_level_init</w:t>
-      </w:r>
-      <w:proofErr w:type="spellEnd"/>
-      <w:r>
-        <w:rPr>
-          <w:rStyle w:val="SubtleEmphasis"/>
-        </w:rPr>
-        <w:t>(</w:t>
-      </w:r>
-      <w:proofErr w:type="spellStart"/>
-      <w:r>
-        <w:rPr>
-          <w:rStyle w:val="SubtleEmphasis"/>
-        </w:rPr>
-        <w:t>netif</w:t>
-      </w:r>
-      <w:proofErr w:type="spellEnd"/>
-      <w:r>
-        <w:rPr>
-          <w:rStyle w:val="SubtleEmphasis"/>
-        </w:rPr>
-        <w:t>);</w:t>
+        <w:t>/* Initialization callback handled by lwIP */</w:t>
+      </w:r>
+    </w:p>
+    <w:p>
+      <w:pPr>
+        <w:pStyle w:val="Heading1"/>
+        <w:numPr>
+          <w:ilvl w:val="0"/>
+          <w:numId w:val="0"/>
+        </w:numPr>
+        <w:ind w:left="720"/>
+        <w:rPr>
+          <w:rStyle w:val="SubtleEmphasis"/>
+        </w:rPr>
+      </w:pPr>
+      <w:r>
+        <w:rPr>
+          <w:rStyle w:val="SubtleEmphasis"/>
+        </w:rPr>
+        <w:t>err_t enc28j60_netif_init(struct netif *netif) {</w:t>
+      </w:r>
+    </w:p>
+    <w:p>
+      <w:pPr>
+        <w:pStyle w:val="Heading1"/>
+        <w:numPr>
+          <w:ilvl w:val="0"/>
+          <w:numId w:val="0"/>
+        </w:numPr>
+        <w:ind w:left="720"/>
+        <w:rPr>
+          <w:rStyle w:val="SubtleEmphasis"/>
+        </w:rPr>
+      </w:pPr>
+      <w:r>
+        <w:rPr>
+          <w:rStyle w:val="SubtleEmphasis"/>
+        </w:rPr>
+        <w:t xml:space="preserve">    netif-&gt;name[0] = 'e';</w:t>
+      </w:r>
+    </w:p>
+    <w:p>
+      <w:pPr>
+        <w:pStyle w:val="Heading1"/>
+        <w:numPr>
+          <w:ilvl w:val="0"/>
+          <w:numId w:val="0"/>
+        </w:numPr>
+        <w:ind w:left="720"/>
+        <w:rPr>
+          <w:rStyle w:val="SubtleEmphasis"/>
+        </w:rPr>
+      </w:pPr>
+      <w:r>
+        <w:rPr>
+          <w:rStyle w:val="SubtleEmphasis"/>
+        </w:rPr>
+        <w:t xml:space="preserve">    netif-&gt;name[1] = 'n';</w:t>
+      </w:r>
+    </w:p>
+    <w:p>
+      <w:pPr>
+        <w:pStyle w:val="Heading1"/>
+        <w:numPr>
+          <w:ilvl w:val="0"/>
+          <w:numId w:val="0"/>
+        </w:numPr>
+        <w:ind w:left="720"/>
+        <w:rPr>
+          <w:rStyle w:val="SubtleEmphasis"/>
+        </w:rPr>
+      </w:pPr>
+      <w:r>
+        <w:rPr>
+          <w:rStyle w:val="SubtleEmphasis"/>
+        </w:rPr>
+        <w:t xml:space="preserve">    netif-&gt;output = etharp_output; // Assigns the ARP handler</w:t>
+      </w:r>
+    </w:p>
+    <w:p>
+      <w:pPr>
+        <w:pStyle w:val="Heading1"/>
+        <w:numPr>
+          <w:ilvl w:val="0"/>
+          <w:numId w:val="0"/>
+        </w:numPr>
+        <w:ind w:left="720"/>
+        <w:rPr>
+          <w:rStyle w:val="SubtleEmphasis"/>
+        </w:rPr>
+      </w:pPr>
+      <w:r>
+        <w:rPr>
+          <w:rStyle w:val="SubtleEmphasis"/>
+        </w:rPr>
+        <w:t xml:space="preserve">    netif-&gt;linkoutput = low_level_output;</w:t>
+      </w:r>
+    </w:p>
+    <w:p>
+      <w:pPr>
+        <w:pStyle w:val="Heading1"/>
+        <w:numPr>
+          <w:ilvl w:val="0"/>
+          <w:numId w:val="0"/>
+        </w:numPr>
+        <w:ind w:left="720"/>
+        <w:rPr>
+          <w:rStyle w:val="SubtleEmphasis"/>
+        </w:rPr>
+      </w:pPr>
+    </w:p>
+    <w:p>
+      <w:pPr>
+        <w:pStyle w:val="Heading1"/>
+        <w:numPr>
+          <w:ilvl w:val="0"/>
+          <w:numId w:val="0"/>
+        </w:numPr>
+        <w:ind w:left="720"/>
+        <w:rPr>
+          <w:rStyle w:val="SubtleEmphasis"/>
+        </w:rPr>
+      </w:pPr>
+      <w:r>
+        <w:rPr>
+          <w:rStyle w:val="SubtleEmphasis"/>
+        </w:rPr>
+        <w:t xml:space="preserve">    low_level_init(netif);</w:t>
       </w:r>
     </w:p>
     <w:p>
@@ -3446,245 +2168,83 @@
         <w:rPr>
           <w:rStyle w:val="SubtleEmphasis"/>
         </w:rPr>
-        <w:t>void enc28j60_netif_</w:t>
-      </w:r>
-      <w:proofErr w:type="gramStart"/>
-      <w:r>
-        <w:rPr>
-          <w:rStyle w:val="SubtleEmphasis"/>
-        </w:rPr>
-        <w:t>poll(</w:t>
-      </w:r>
-      <w:proofErr w:type="gramEnd"/>
-      <w:r>
-        <w:rPr>
-          <w:rStyle w:val="SubtleEmphasis"/>
-        </w:rPr>
-        <w:t xml:space="preserve">struct </w:t>
-      </w:r>
-      <w:proofErr w:type="spellStart"/>
-      <w:r>
-        <w:rPr>
-          <w:rStyle w:val="SubtleEmphasis"/>
-        </w:rPr>
-        <w:t>netif</w:t>
-      </w:r>
-      <w:proofErr w:type="spellEnd"/>
-      <w:r>
-        <w:rPr>
-          <w:rStyle w:val="SubtleEmphasis"/>
-        </w:rPr>
-        <w:t xml:space="preserve"> *</w:t>
-      </w:r>
-      <w:proofErr w:type="spellStart"/>
-      <w:r>
-        <w:rPr>
-          <w:rStyle w:val="SubtleEmphasis"/>
-        </w:rPr>
-        <w:t>netif</w:t>
-      </w:r>
-      <w:proofErr w:type="spellEnd"/>
-      <w:r>
-        <w:rPr>
-          <w:rStyle w:val="SubtleEmphasis"/>
-        </w:rPr>
-        <w:t>) {</w:t>
-      </w:r>
-    </w:p>
-    <w:p>
-      <w:pPr>
-        <w:pStyle w:val="Heading1"/>
-        <w:numPr>
-          <w:ilvl w:val="0"/>
-          <w:numId w:val="0"/>
-        </w:numPr>
-        <w:ind w:left="720"/>
-        <w:rPr>
-          <w:rStyle w:val="SubtleEmphasis"/>
-        </w:rPr>
-      </w:pPr>
-      <w:r>
-        <w:rPr>
-          <w:rStyle w:val="SubtleEmphasis"/>
-        </w:rPr>
-        <w:t xml:space="preserve">    struct </w:t>
-      </w:r>
-      <w:proofErr w:type="spellStart"/>
-      <w:r>
-        <w:rPr>
-          <w:rStyle w:val="SubtleEmphasis"/>
-        </w:rPr>
-        <w:t>pbuf</w:t>
-      </w:r>
-      <w:proofErr w:type="spellEnd"/>
-      <w:r>
-        <w:rPr>
-          <w:rStyle w:val="SubtleEmphasis"/>
-        </w:rPr>
-        <w:t xml:space="preserve"> *p = </w:t>
-      </w:r>
-      <w:proofErr w:type="spellStart"/>
-      <w:r>
-        <w:rPr>
-          <w:rStyle w:val="SubtleEmphasis"/>
-        </w:rPr>
-        <w:t>low_level_input</w:t>
-      </w:r>
-      <w:proofErr w:type="spellEnd"/>
-      <w:r>
-        <w:rPr>
-          <w:rStyle w:val="SubtleEmphasis"/>
-        </w:rPr>
-        <w:t>(</w:t>
-      </w:r>
-      <w:proofErr w:type="spellStart"/>
-      <w:r>
-        <w:rPr>
-          <w:rStyle w:val="SubtleEmphasis"/>
-        </w:rPr>
-        <w:t>netif</w:t>
-      </w:r>
-      <w:proofErr w:type="spellEnd"/>
-      <w:r>
-        <w:rPr>
-          <w:rStyle w:val="SubtleEmphasis"/>
-        </w:rPr>
-        <w:t>);</w:t>
-      </w:r>
-    </w:p>
-    <w:p>
-      <w:pPr>
-        <w:pStyle w:val="Heading1"/>
-        <w:numPr>
-          <w:ilvl w:val="0"/>
-          <w:numId w:val="0"/>
-        </w:numPr>
-        <w:ind w:left="720"/>
-        <w:rPr>
-          <w:rStyle w:val="SubtleEmphasis"/>
-        </w:rPr>
-      </w:pPr>
-      <w:r>
-        <w:rPr>
-          <w:rStyle w:val="SubtleEmphasis"/>
-        </w:rPr>
-        <w:t xml:space="preserve">    if (</w:t>
-      </w:r>
-      <w:proofErr w:type="gramStart"/>
-      <w:r>
-        <w:rPr>
-          <w:rStyle w:val="SubtleEmphasis"/>
-        </w:rPr>
-        <w:t>p !</w:t>
-      </w:r>
-      <w:proofErr w:type="gramEnd"/>
-      <w:r>
-        <w:rPr>
-          <w:rStyle w:val="SubtleEmphasis"/>
-        </w:rPr>
-        <w:t>= NULL) {</w:t>
-      </w:r>
-    </w:p>
-    <w:p>
-      <w:pPr>
-        <w:pStyle w:val="Heading1"/>
-        <w:numPr>
-          <w:ilvl w:val="0"/>
-          <w:numId w:val="0"/>
-        </w:numPr>
-        <w:ind w:left="720"/>
-        <w:rPr>
-          <w:rStyle w:val="SubtleEmphasis"/>
-        </w:rPr>
-      </w:pPr>
-      <w:r>
-        <w:rPr>
-          <w:rStyle w:val="SubtleEmphasis"/>
-        </w:rPr>
-        <w:t xml:space="preserve">        if (</w:t>
-      </w:r>
-      <w:proofErr w:type="spellStart"/>
-      <w:r>
-        <w:rPr>
-          <w:rStyle w:val="SubtleEmphasis"/>
-        </w:rPr>
-        <w:t>netif</w:t>
-      </w:r>
-      <w:proofErr w:type="spellEnd"/>
-      <w:r>
-        <w:rPr>
-          <w:rStyle w:val="SubtleEmphasis"/>
-        </w:rPr>
-        <w:t>-&gt;</w:t>
-      </w:r>
-      <w:proofErr w:type="gramStart"/>
-      <w:r>
-        <w:rPr>
-          <w:rStyle w:val="SubtleEmphasis"/>
-        </w:rPr>
-        <w:t>input(</w:t>
-      </w:r>
-      <w:proofErr w:type="gramEnd"/>
-      <w:r>
-        <w:rPr>
-          <w:rStyle w:val="SubtleEmphasis"/>
-        </w:rPr>
-        <w:t xml:space="preserve">p, </w:t>
-      </w:r>
-      <w:proofErr w:type="spellStart"/>
-      <w:r>
-        <w:rPr>
-          <w:rStyle w:val="SubtleEmphasis"/>
-        </w:rPr>
-        <w:t>netif</w:t>
-      </w:r>
-      <w:proofErr w:type="spellEnd"/>
-      <w:proofErr w:type="gramStart"/>
-      <w:r>
-        <w:rPr>
-          <w:rStyle w:val="SubtleEmphasis"/>
-        </w:rPr>
-        <w:t>) !</w:t>
-      </w:r>
-      <w:proofErr w:type="gramEnd"/>
-      <w:r>
-        <w:rPr>
-          <w:rStyle w:val="SubtleEmphasis"/>
-        </w:rPr>
-        <w:t>= ERR_OK) {</w:t>
-      </w:r>
-    </w:p>
-    <w:p>
-      <w:pPr>
-        <w:pStyle w:val="Heading1"/>
-        <w:numPr>
-          <w:ilvl w:val="0"/>
-          <w:numId w:val="0"/>
-        </w:numPr>
-        <w:ind w:left="720"/>
-        <w:rPr>
-          <w:rStyle w:val="SubtleEmphasis"/>
-        </w:rPr>
-      </w:pPr>
-      <w:r>
-        <w:rPr>
-          <w:rStyle w:val="SubtleEmphasis"/>
-        </w:rPr>
-        <w:t xml:space="preserve">            </w:t>
-      </w:r>
-      <w:proofErr w:type="spellStart"/>
-      <w:r>
-        <w:rPr>
-          <w:rStyle w:val="SubtleEmphasis"/>
-        </w:rPr>
-        <w:t>pbuf_free</w:t>
-      </w:r>
-      <w:proofErr w:type="spellEnd"/>
-      <w:r>
-        <w:rPr>
-          <w:rStyle w:val="SubtleEmphasis"/>
-        </w:rPr>
-        <w:t>(p);</w:t>
+        <w:t>void enc28j60_netif_poll(struct netif *netif) {</w:t>
+      </w:r>
+    </w:p>
+    <w:p>
+      <w:pPr>
+        <w:pStyle w:val="Heading1"/>
+        <w:numPr>
+          <w:ilvl w:val="0"/>
+          <w:numId w:val="0"/>
+        </w:numPr>
+        <w:ind w:left="720"/>
+        <w:rPr>
+          <w:rStyle w:val="SubtleEmphasis"/>
+        </w:rPr>
+      </w:pPr>
+      <w:r>
+        <w:rPr>
+          <w:rStyle w:val="SubtleEmphasis"/>
+        </w:rPr>
+        <w:t xml:space="preserve">    struct pbuf *p = low_level_input(netif);</w:t>
+      </w:r>
+    </w:p>
+    <w:p>
+      <w:pPr>
+        <w:pStyle w:val="Heading1"/>
+        <w:numPr>
+          <w:ilvl w:val="0"/>
+          <w:numId w:val="0"/>
+        </w:numPr>
+        <w:ind w:left="720"/>
+        <w:rPr>
+          <w:rStyle w:val="SubtleEmphasis"/>
+        </w:rPr>
+      </w:pPr>
+      <w:r>
+        <w:rPr>
+          <w:rStyle w:val="SubtleEmphasis"/>
+        </w:rPr>
+        <w:t xml:space="preserve">    if (p != NULL) {</w:t>
+      </w:r>
+    </w:p>
+    <w:p>
+      <w:pPr>
+        <w:pStyle w:val="Heading1"/>
+        <w:numPr>
+          <w:ilvl w:val="0"/>
+          <w:numId w:val="0"/>
+        </w:numPr>
+        <w:ind w:left="720"/>
+        <w:rPr>
+          <w:rStyle w:val="SubtleEmphasis"/>
+        </w:rPr>
+      </w:pPr>
+      <w:r>
+        <w:rPr>
+          <w:rStyle w:val="SubtleEmphasis"/>
+        </w:rPr>
+        <w:t xml:space="preserve">        if (netif-&gt;input(p, netif) != ERR_OK) {</w:t>
+      </w:r>
+    </w:p>
+    <w:p>
+      <w:pPr>
+        <w:pStyle w:val="Heading1"/>
+        <w:numPr>
+          <w:ilvl w:val="0"/>
+          <w:numId w:val="0"/>
+        </w:numPr>
+        <w:ind w:left="720"/>
+        <w:rPr>
+          <w:rStyle w:val="SubtleEmphasis"/>
+        </w:rPr>
+      </w:pPr>
+      <w:r>
+        <w:rPr>
+          <w:rStyle w:val="SubtleEmphasis"/>
+        </w:rPr>
+        <w:t xml:space="preserve">            pbuf_free(p);</w:t>
       </w:r>
     </w:p>
     <w:p>
@@ -3779,21 +2339,7 @@
         <w:rPr>
           <w:rStyle w:val="SubtleEmphasis"/>
         </w:rPr>
-        <w:t>Step 3: Main Initialization and Runtime Loop (</w:t>
-      </w:r>
-      <w:proofErr w:type="spellStart"/>
-      <w:r>
-        <w:rPr>
-          <w:rStyle w:val="SubtleEmphasis"/>
-        </w:rPr>
-        <w:t>main.c</w:t>
-      </w:r>
-      <w:proofErr w:type="spellEnd"/>
-      <w:r>
-        <w:rPr>
-          <w:rStyle w:val="SubtleEmphasis"/>
-        </w:rPr>
-        <w:t>)</w:t>
+        <w:t>Step 3: Main Initialization and Runtime Loop (main.c)</w:t>
       </w:r>
     </w:p>
     <w:p>
@@ -3865,255 +2411,115 @@
         <w:rPr>
           <w:rStyle w:val="SubtleEmphasis"/>
         </w:rPr>
-        <w:t>#include "</w:t>
-      </w:r>
-      <w:proofErr w:type="spellStart"/>
-      <w:r>
-        <w:rPr>
-          <w:rStyle w:val="SubtleEmphasis"/>
-        </w:rPr>
-        <w:t>lwip</w:t>
-      </w:r>
-      <w:proofErr w:type="spellEnd"/>
-      <w:r>
-        <w:rPr>
-          <w:rStyle w:val="SubtleEmphasis"/>
-        </w:rPr>
-        <w:t>/</w:t>
-      </w:r>
-      <w:proofErr w:type="spellStart"/>
-      <w:r>
-        <w:rPr>
-          <w:rStyle w:val="SubtleEmphasis"/>
-        </w:rPr>
-        <w:t>init.h</w:t>
-      </w:r>
-      <w:proofErr w:type="spellEnd"/>
-      <w:r>
-        <w:rPr>
-          <w:rStyle w:val="SubtleEmphasis"/>
-        </w:rPr>
-        <w:t>"</w:t>
-      </w:r>
-    </w:p>
-    <w:p>
-      <w:pPr>
-        <w:pStyle w:val="Heading1"/>
-        <w:numPr>
-          <w:ilvl w:val="0"/>
-          <w:numId w:val="0"/>
-        </w:numPr>
-        <w:ind w:left="720"/>
-        <w:rPr>
-          <w:rStyle w:val="SubtleEmphasis"/>
-        </w:rPr>
-      </w:pPr>
-      <w:r>
-        <w:rPr>
-          <w:rStyle w:val="SubtleEmphasis"/>
-        </w:rPr>
-        <w:t>#include "</w:t>
-      </w:r>
-      <w:proofErr w:type="spellStart"/>
-      <w:r>
-        <w:rPr>
-          <w:rStyle w:val="SubtleEmphasis"/>
-        </w:rPr>
-        <w:t>lwip</w:t>
-      </w:r>
-      <w:proofErr w:type="spellEnd"/>
-      <w:r>
-        <w:rPr>
-          <w:rStyle w:val="SubtleEmphasis"/>
-        </w:rPr>
-        <w:t>/</w:t>
-      </w:r>
-      <w:proofErr w:type="spellStart"/>
-      <w:r>
-        <w:rPr>
-          <w:rStyle w:val="SubtleEmphasis"/>
-        </w:rPr>
-        <w:t>netif.h</w:t>
-      </w:r>
-      <w:proofErr w:type="spellEnd"/>
-      <w:r>
-        <w:rPr>
-          <w:rStyle w:val="SubtleEmphasis"/>
-        </w:rPr>
-        <w:t>"</w:t>
-      </w:r>
-    </w:p>
-    <w:p>
-      <w:pPr>
-        <w:pStyle w:val="Heading1"/>
-        <w:numPr>
-          <w:ilvl w:val="0"/>
-          <w:numId w:val="0"/>
-        </w:numPr>
-        <w:ind w:left="720"/>
-        <w:rPr>
-          <w:rStyle w:val="SubtleEmphasis"/>
-        </w:rPr>
-      </w:pPr>
-      <w:r>
-        <w:rPr>
-          <w:rStyle w:val="SubtleEmphasis"/>
-        </w:rPr>
-        <w:t>#include "</w:t>
-      </w:r>
-      <w:proofErr w:type="spellStart"/>
-      <w:r>
-        <w:rPr>
-          <w:rStyle w:val="SubtleEmphasis"/>
-        </w:rPr>
-        <w:t>lwip</w:t>
-      </w:r>
-      <w:proofErr w:type="spellEnd"/>
-      <w:r>
-        <w:rPr>
-          <w:rStyle w:val="SubtleEmphasis"/>
-        </w:rPr>
-        <w:t>/</w:t>
-      </w:r>
-      <w:proofErr w:type="spellStart"/>
-      <w:r>
-        <w:rPr>
-          <w:rStyle w:val="SubtleEmphasis"/>
-        </w:rPr>
-        <w:t>ip_addr.h</w:t>
-      </w:r>
-      <w:proofErr w:type="spellEnd"/>
-      <w:r>
-        <w:rPr>
-          <w:rStyle w:val="SubtleEmphasis"/>
-        </w:rPr>
-        <w:t>"</w:t>
-      </w:r>
-    </w:p>
-    <w:p>
-      <w:pPr>
-        <w:pStyle w:val="Heading1"/>
-        <w:numPr>
-          <w:ilvl w:val="0"/>
-          <w:numId w:val="0"/>
-        </w:numPr>
-        <w:ind w:left="720"/>
-        <w:rPr>
-          <w:rStyle w:val="SubtleEmphasis"/>
-        </w:rPr>
-      </w:pPr>
-      <w:r>
-        <w:rPr>
-          <w:rStyle w:val="SubtleEmphasis"/>
-        </w:rPr>
-        <w:t>#include "</w:t>
-      </w:r>
-      <w:proofErr w:type="spellStart"/>
-      <w:r>
-        <w:rPr>
-          <w:rStyle w:val="SubtleEmphasis"/>
-        </w:rPr>
-        <w:t>lwip</w:t>
-      </w:r>
-      <w:proofErr w:type="spellEnd"/>
-      <w:r>
-        <w:rPr>
-          <w:rStyle w:val="SubtleEmphasis"/>
-        </w:rPr>
-        <w:t>/</w:t>
-      </w:r>
-      <w:proofErr w:type="spellStart"/>
-      <w:r>
-        <w:rPr>
-          <w:rStyle w:val="SubtleEmphasis"/>
-        </w:rPr>
-        <w:t>timeouts.h</w:t>
-      </w:r>
-      <w:proofErr w:type="spellEnd"/>
-      <w:r>
-        <w:rPr>
-          <w:rStyle w:val="SubtleEmphasis"/>
-        </w:rPr>
-        <w:t>"</w:t>
-      </w:r>
-    </w:p>
-    <w:p>
-      <w:pPr>
-        <w:pStyle w:val="Heading1"/>
-        <w:numPr>
-          <w:ilvl w:val="0"/>
-          <w:numId w:val="0"/>
-        </w:numPr>
-        <w:ind w:left="720"/>
-        <w:rPr>
-          <w:rStyle w:val="SubtleEmphasis"/>
-        </w:rPr>
-      </w:pPr>
-      <w:r>
-        <w:rPr>
-          <w:rStyle w:val="SubtleEmphasis"/>
-        </w:rPr>
-        <w:t>#include "</w:t>
-      </w:r>
-      <w:proofErr w:type="spellStart"/>
-      <w:r>
-        <w:rPr>
-          <w:rStyle w:val="SubtleEmphasis"/>
-        </w:rPr>
-        <w:t>ethernetif.h</w:t>
-      </w:r>
-      <w:proofErr w:type="spellEnd"/>
-      <w:r>
-        <w:rPr>
-          <w:rStyle w:val="SubtleEmphasis"/>
-        </w:rPr>
-        <w:t>"</w:t>
-      </w:r>
-    </w:p>
-    <w:p>
-      <w:pPr>
-        <w:pStyle w:val="Heading1"/>
-        <w:numPr>
-          <w:ilvl w:val="0"/>
-          <w:numId w:val="0"/>
-        </w:numPr>
-        <w:ind w:left="720"/>
-        <w:rPr>
-          <w:rStyle w:val="SubtleEmphasis"/>
-        </w:rPr>
-      </w:pPr>
-    </w:p>
-    <w:p>
-      <w:pPr>
-        <w:pStyle w:val="Heading1"/>
-        <w:numPr>
-          <w:ilvl w:val="0"/>
-          <w:numId w:val="0"/>
-        </w:numPr>
-        <w:ind w:left="720"/>
-        <w:rPr>
-          <w:rStyle w:val="SubtleEmphasis"/>
-        </w:rPr>
-      </w:pPr>
-      <w:r>
-        <w:rPr>
-          <w:rStyle w:val="SubtleEmphasis"/>
-        </w:rPr>
-        <w:t xml:space="preserve">struct </w:t>
-      </w:r>
-      <w:proofErr w:type="spellStart"/>
-      <w:r>
-        <w:rPr>
-          <w:rStyle w:val="SubtleEmphasis"/>
-        </w:rPr>
-        <w:t>netif</w:t>
-      </w:r>
-      <w:proofErr w:type="spellEnd"/>
-      <w:r>
-        <w:rPr>
-          <w:rStyle w:val="SubtleEmphasis"/>
-        </w:rPr>
-        <w:t xml:space="preserve"> enc28j60_netif;</w:t>
+        <w:t>#include "lwip/init.h"</w:t>
+      </w:r>
+    </w:p>
+    <w:p>
+      <w:pPr>
+        <w:pStyle w:val="Heading1"/>
+        <w:numPr>
+          <w:ilvl w:val="0"/>
+          <w:numId w:val="0"/>
+        </w:numPr>
+        <w:ind w:left="720"/>
+        <w:rPr>
+          <w:rStyle w:val="SubtleEmphasis"/>
+        </w:rPr>
+      </w:pPr>
+      <w:r>
+        <w:rPr>
+          <w:rStyle w:val="SubtleEmphasis"/>
+        </w:rPr>
+        <w:t>#include "lwip/netif.h"</w:t>
+      </w:r>
+    </w:p>
+    <w:p>
+      <w:pPr>
+        <w:pStyle w:val="Heading1"/>
+        <w:numPr>
+          <w:ilvl w:val="0"/>
+          <w:numId w:val="0"/>
+        </w:numPr>
+        <w:ind w:left="720"/>
+        <w:rPr>
+          <w:rStyle w:val="SubtleEmphasis"/>
+        </w:rPr>
+      </w:pPr>
+      <w:r>
+        <w:rPr>
+          <w:rStyle w:val="SubtleEmphasis"/>
+        </w:rPr>
+        <w:t>#include "lwip/ip_addr.h"</w:t>
+      </w:r>
+    </w:p>
+    <w:p>
+      <w:pPr>
+        <w:pStyle w:val="Heading1"/>
+        <w:numPr>
+          <w:ilvl w:val="0"/>
+          <w:numId w:val="0"/>
+        </w:numPr>
+        <w:ind w:left="720"/>
+        <w:rPr>
+          <w:rStyle w:val="SubtleEmphasis"/>
+        </w:rPr>
+      </w:pPr>
+      <w:r>
+        <w:rPr>
+          <w:rStyle w:val="SubtleEmphasis"/>
+        </w:rPr>
+        <w:t>#include "lwip/timeouts.h"</w:t>
+      </w:r>
+    </w:p>
+    <w:p>
+      <w:pPr>
+        <w:pStyle w:val="Heading1"/>
+        <w:numPr>
+          <w:ilvl w:val="0"/>
+          <w:numId w:val="0"/>
+        </w:numPr>
+        <w:ind w:left="720"/>
+        <w:rPr>
+          <w:rStyle w:val="SubtleEmphasis"/>
+        </w:rPr>
+      </w:pPr>
+      <w:r>
+        <w:rPr>
+          <w:rStyle w:val="SubtleEmphasis"/>
+        </w:rPr>
+        <w:t>#include "ethernetif.h"</w:t>
+      </w:r>
+    </w:p>
+    <w:p>
+      <w:pPr>
+        <w:pStyle w:val="Heading1"/>
+        <w:numPr>
+          <w:ilvl w:val="0"/>
+          <w:numId w:val="0"/>
+        </w:numPr>
+        <w:ind w:left="720"/>
+        <w:rPr>
+          <w:rStyle w:val="SubtleEmphasis"/>
+        </w:rPr>
+      </w:pPr>
+    </w:p>
+    <w:p>
+      <w:pPr>
+        <w:pStyle w:val="Heading1"/>
+        <w:numPr>
+          <w:ilvl w:val="0"/>
+          <w:numId w:val="0"/>
+        </w:numPr>
+        <w:ind w:left="720"/>
+        <w:rPr>
+          <w:rStyle w:val="SubtleEmphasis"/>
+        </w:rPr>
+      </w:pPr>
+      <w:r>
+        <w:rPr>
+          <w:rStyle w:val="SubtleEmphasis"/>
+        </w:rPr>
+        <w:t>struct netif enc28j60_netif;</w:t>
       </w:r>
     </w:p>
     <w:p>
@@ -4202,68 +2608,26 @@
         <w:rPr>
           <w:rStyle w:val="SubtleEmphasis"/>
         </w:rPr>
-        <w:t xml:space="preserve">    // 2. Initialize </w:t>
-      </w:r>
-      <w:proofErr w:type="spellStart"/>
-      <w:r>
-        <w:rPr>
-          <w:rStyle w:val="SubtleEmphasis"/>
-        </w:rPr>
-        <w:t>lwIP</w:t>
-      </w:r>
-      <w:proofErr w:type="spellEnd"/>
-      <w:r>
-        <w:rPr>
-          <w:rStyle w:val="SubtleEmphasis"/>
-        </w:rPr>
-        <w:t xml:space="preserve"> Stack</w:t>
-      </w:r>
-    </w:p>
-    <w:p>
-      <w:pPr>
-        <w:pStyle w:val="Heading1"/>
-        <w:numPr>
-          <w:ilvl w:val="0"/>
-          <w:numId w:val="0"/>
-        </w:numPr>
-        <w:ind w:left="720"/>
-        <w:rPr>
-          <w:rStyle w:val="SubtleEmphasis"/>
-        </w:rPr>
-      </w:pPr>
-      <w:r>
-        <w:rPr>
-          <w:rStyle w:val="SubtleEmphasis"/>
-        </w:rPr>
-        <w:t xml:space="preserve">    </w:t>
-      </w:r>
-      <w:proofErr w:type="spellStart"/>
-      <w:r>
-        <w:rPr>
-          <w:rStyle w:val="SubtleEmphasis"/>
-        </w:rPr>
-        <w:t>lwip_</w:t>
-      </w:r>
-      <w:proofErr w:type="gramStart"/>
-      <w:r>
-        <w:rPr>
-          <w:rStyle w:val="SubtleEmphasis"/>
-        </w:rPr>
-        <w:t>init</w:t>
-      </w:r>
-      <w:proofErr w:type="spellEnd"/>
-      <w:r>
-        <w:rPr>
-          <w:rStyle w:val="SubtleEmphasis"/>
-        </w:rPr>
-        <w:t>(</w:t>
-      </w:r>
-      <w:proofErr w:type="gramEnd"/>
-      <w:r>
-        <w:rPr>
-          <w:rStyle w:val="SubtleEmphasis"/>
-        </w:rPr>
-        <w:t>);</w:t>
+        <w:t xml:space="preserve">    // 2. Initialize lwIP Stack</w:t>
+      </w:r>
+    </w:p>
+    <w:p>
+      <w:pPr>
+        <w:pStyle w:val="Heading1"/>
+        <w:numPr>
+          <w:ilvl w:val="0"/>
+          <w:numId w:val="0"/>
+        </w:numPr>
+        <w:ind w:left="720"/>
+        <w:rPr>
+          <w:rStyle w:val="SubtleEmphasis"/>
+        </w:rPr>
+      </w:pPr>
+      <w:r>
+        <w:rPr>
+          <w:rStyle w:val="SubtleEmphasis"/>
+        </w:rPr>
+        <w:t xml:space="preserve">    lwip_init();</w:t>
       </w:r>
     </w:p>
     <w:p>
@@ -4314,385 +2678,153 @@
         <w:rPr>
           <w:rStyle w:val="SubtleEmphasis"/>
         </w:rPr>
-        <w:t xml:space="preserve">    ip4_addr_t </w:t>
-      </w:r>
-      <w:proofErr w:type="spellStart"/>
-      <w:r>
-        <w:rPr>
-          <w:rStyle w:val="SubtleEmphasis"/>
-        </w:rPr>
-        <w:t>ipaddr</w:t>
-      </w:r>
-      <w:proofErr w:type="spellEnd"/>
-      <w:r>
-        <w:rPr>
-          <w:rStyle w:val="SubtleEmphasis"/>
-        </w:rPr>
-        <w:t xml:space="preserve">, netmask, </w:t>
-      </w:r>
-      <w:proofErr w:type="spellStart"/>
-      <w:r>
-        <w:rPr>
-          <w:rStyle w:val="SubtleEmphasis"/>
-        </w:rPr>
-        <w:t>gw</w:t>
-      </w:r>
-      <w:proofErr w:type="spellEnd"/>
-      <w:r>
-        <w:rPr>
-          <w:rStyle w:val="SubtleEmphasis"/>
-        </w:rPr>
-        <w:t>;</w:t>
-      </w:r>
-    </w:p>
-    <w:p>
-      <w:pPr>
-        <w:pStyle w:val="Heading1"/>
-        <w:numPr>
-          <w:ilvl w:val="0"/>
-          <w:numId w:val="0"/>
-        </w:numPr>
-        <w:ind w:left="720"/>
-        <w:rPr>
-          <w:rStyle w:val="SubtleEmphasis"/>
-        </w:rPr>
-      </w:pPr>
-      <w:r>
-        <w:rPr>
-          <w:rStyle w:val="SubtleEmphasis"/>
-        </w:rPr>
-        <w:t xml:space="preserve">    IP4_</w:t>
-      </w:r>
-      <w:proofErr w:type="gramStart"/>
-      <w:r>
-        <w:rPr>
-          <w:rStyle w:val="SubtleEmphasis"/>
-        </w:rPr>
-        <w:t>ADDR(</w:t>
-      </w:r>
-      <w:proofErr w:type="gramEnd"/>
-      <w:r>
-        <w:rPr>
-          <w:rStyle w:val="SubtleEmphasis"/>
-        </w:rPr>
-        <w:t>&amp;</w:t>
-      </w:r>
-      <w:proofErr w:type="spellStart"/>
-      <w:r>
-        <w:rPr>
-          <w:rStyle w:val="SubtleEmphasis"/>
-        </w:rPr>
-        <w:t>ipaddr</w:t>
-      </w:r>
-      <w:proofErr w:type="spellEnd"/>
-      <w:r>
-        <w:rPr>
-          <w:rStyle w:val="SubtleEmphasis"/>
-        </w:rPr>
-        <w:t>, 192, 168, 1, 150</w:t>
-      </w:r>
-      <w:proofErr w:type="gramStart"/>
-      <w:r>
-        <w:rPr>
-          <w:rStyle w:val="SubtleEmphasis"/>
-        </w:rPr>
-        <w:t>);  /</w:t>
-      </w:r>
-      <w:proofErr w:type="gramEnd"/>
-      <w:r>
-        <w:rPr>
-          <w:rStyle w:val="SubtleEmphasis"/>
-        </w:rPr>
-        <w:t>/ Static IP address</w:t>
-      </w:r>
-    </w:p>
-    <w:p>
-      <w:pPr>
-        <w:pStyle w:val="Heading1"/>
-        <w:numPr>
-          <w:ilvl w:val="0"/>
-          <w:numId w:val="0"/>
-        </w:numPr>
-        <w:ind w:left="720"/>
-        <w:rPr>
-          <w:rStyle w:val="SubtleEmphasis"/>
-        </w:rPr>
-      </w:pPr>
-      <w:r>
-        <w:rPr>
-          <w:rStyle w:val="SubtleEmphasis"/>
-        </w:rPr>
-        <w:t xml:space="preserve">    IP4_</w:t>
-      </w:r>
-      <w:proofErr w:type="gramStart"/>
-      <w:r>
-        <w:rPr>
-          <w:rStyle w:val="SubtleEmphasis"/>
-        </w:rPr>
-        <w:t>ADDR(</w:t>
-      </w:r>
-      <w:proofErr w:type="gramEnd"/>
-      <w:r>
-        <w:rPr>
-          <w:rStyle w:val="SubtleEmphasis"/>
-        </w:rPr>
-        <w:t>&amp;netmask, 255, 255, 255, 0); // Netmask</w:t>
-      </w:r>
-    </w:p>
-    <w:p>
-      <w:pPr>
-        <w:pStyle w:val="Heading1"/>
-        <w:numPr>
-          <w:ilvl w:val="0"/>
-          <w:numId w:val="0"/>
-        </w:numPr>
-        <w:ind w:left="720"/>
-        <w:rPr>
-          <w:rStyle w:val="SubtleEmphasis"/>
-        </w:rPr>
-      </w:pPr>
-      <w:r>
-        <w:rPr>
-          <w:rStyle w:val="SubtleEmphasis"/>
-        </w:rPr>
-        <w:t xml:space="preserve">    IP4_</w:t>
-      </w:r>
-      <w:proofErr w:type="gramStart"/>
-      <w:r>
-        <w:rPr>
-          <w:rStyle w:val="SubtleEmphasis"/>
-        </w:rPr>
-        <w:t>ADDR(</w:t>
-      </w:r>
-      <w:proofErr w:type="gramEnd"/>
-      <w:r>
-        <w:rPr>
-          <w:rStyle w:val="SubtleEmphasis"/>
-        </w:rPr>
-        <w:t>&amp;</w:t>
-      </w:r>
-      <w:proofErr w:type="spellStart"/>
-      <w:r>
-        <w:rPr>
-          <w:rStyle w:val="SubtleEmphasis"/>
-        </w:rPr>
-        <w:t>gw</w:t>
-      </w:r>
-      <w:proofErr w:type="spellEnd"/>
-      <w:r>
-        <w:rPr>
-          <w:rStyle w:val="SubtleEmphasis"/>
-        </w:rPr>
-        <w:t>, 192, 168, 1, 1</w:t>
-      </w:r>
-      <w:proofErr w:type="gramStart"/>
-      <w:r>
-        <w:rPr>
-          <w:rStyle w:val="SubtleEmphasis"/>
-        </w:rPr>
-        <w:t xml:space="preserve">);   </w:t>
-      </w:r>
-      <w:proofErr w:type="gramEnd"/>
-      <w:r>
-        <w:rPr>
-          <w:rStyle w:val="SubtleEmphasis"/>
-        </w:rPr>
-        <w:t xml:space="preserve">     // Gateway IP</w:t>
-      </w:r>
-    </w:p>
-    <w:p>
-      <w:pPr>
-        <w:pStyle w:val="Heading1"/>
-        <w:numPr>
-          <w:ilvl w:val="0"/>
-          <w:numId w:val="0"/>
-        </w:numPr>
-        <w:ind w:left="720"/>
-        <w:rPr>
-          <w:rStyle w:val="SubtleEmphasis"/>
-        </w:rPr>
-      </w:pPr>
-    </w:p>
-    <w:p>
-      <w:pPr>
-        <w:pStyle w:val="Heading1"/>
-        <w:numPr>
-          <w:ilvl w:val="0"/>
-          <w:numId w:val="0"/>
-        </w:numPr>
-        <w:ind w:left="720"/>
-        <w:rPr>
-          <w:rStyle w:val="SubtleEmphasis"/>
-        </w:rPr>
-      </w:pPr>
-      <w:r>
-        <w:rPr>
-          <w:rStyle w:val="SubtleEmphasis"/>
-        </w:rPr>
-        <w:t xml:space="preserve">    // 4. Bind ENC28J60 interface to </w:t>
-      </w:r>
-      <w:proofErr w:type="spellStart"/>
-      <w:r>
-        <w:rPr>
-          <w:rStyle w:val="SubtleEmphasis"/>
-        </w:rPr>
-        <w:t>lwIP</w:t>
-      </w:r>
-      <w:proofErr w:type="spellEnd"/>
-    </w:p>
-    <w:p>
-      <w:pPr>
-        <w:pStyle w:val="Heading1"/>
-        <w:numPr>
-          <w:ilvl w:val="0"/>
-          <w:numId w:val="0"/>
-        </w:numPr>
-        <w:ind w:left="720"/>
-        <w:rPr>
-          <w:rStyle w:val="SubtleEmphasis"/>
-        </w:rPr>
-      </w:pPr>
-      <w:r>
-        <w:rPr>
-          <w:rStyle w:val="SubtleEmphasis"/>
-        </w:rPr>
-        <w:t xml:space="preserve">    </w:t>
-      </w:r>
-      <w:proofErr w:type="spellStart"/>
-      <w:r>
-        <w:rPr>
-          <w:rStyle w:val="SubtleEmphasis"/>
-        </w:rPr>
-        <w:t>netif_</w:t>
-      </w:r>
-      <w:proofErr w:type="gramStart"/>
-      <w:r>
-        <w:rPr>
-          <w:rStyle w:val="SubtleEmphasis"/>
-        </w:rPr>
-        <w:t>add</w:t>
-      </w:r>
-      <w:proofErr w:type="spellEnd"/>
-      <w:r>
-        <w:rPr>
-          <w:rStyle w:val="SubtleEmphasis"/>
-        </w:rPr>
-        <w:t>(</w:t>
-      </w:r>
-      <w:proofErr w:type="gramEnd"/>
-      <w:r>
-        <w:rPr>
-          <w:rStyle w:val="SubtleEmphasis"/>
-        </w:rPr>
-        <w:t>&amp;enc28j60_netif, &amp;</w:t>
-      </w:r>
-      <w:proofErr w:type="spellStart"/>
-      <w:r>
-        <w:rPr>
-          <w:rStyle w:val="SubtleEmphasis"/>
-        </w:rPr>
-        <w:t>ipaddr</w:t>
-      </w:r>
-      <w:proofErr w:type="spellEnd"/>
-      <w:r>
-        <w:rPr>
-          <w:rStyle w:val="SubtleEmphasis"/>
-        </w:rPr>
-        <w:t>, &amp;netmask, &amp;</w:t>
-      </w:r>
-      <w:proofErr w:type="spellStart"/>
-      <w:r>
-        <w:rPr>
-          <w:rStyle w:val="SubtleEmphasis"/>
-        </w:rPr>
-        <w:t>gw</w:t>
-      </w:r>
-      <w:proofErr w:type="spellEnd"/>
-      <w:r>
-        <w:rPr>
-          <w:rStyle w:val="SubtleEmphasis"/>
-        </w:rPr>
-        <w:t>, NULL, &amp;enc28j60_netif_init, &amp;</w:t>
-      </w:r>
-      <w:proofErr w:type="spellStart"/>
-      <w:r>
-        <w:rPr>
-          <w:rStyle w:val="SubtleEmphasis"/>
-        </w:rPr>
-        <w:t>ethernet_input</w:t>
-      </w:r>
-      <w:proofErr w:type="spellEnd"/>
-      <w:r>
-        <w:rPr>
-          <w:rStyle w:val="SubtleEmphasis"/>
-        </w:rPr>
-        <w:t>);</w:t>
-      </w:r>
-    </w:p>
-    <w:p>
-      <w:pPr>
-        <w:pStyle w:val="Heading1"/>
-        <w:numPr>
-          <w:ilvl w:val="0"/>
-          <w:numId w:val="0"/>
-        </w:numPr>
-        <w:ind w:left="720"/>
-        <w:rPr>
-          <w:rStyle w:val="SubtleEmphasis"/>
-        </w:rPr>
-      </w:pPr>
-      <w:r>
-        <w:rPr>
-          <w:rStyle w:val="SubtleEmphasis"/>
-        </w:rPr>
-        <w:t xml:space="preserve">    </w:t>
-      </w:r>
-      <w:proofErr w:type="spellStart"/>
-      <w:r>
-        <w:rPr>
-          <w:rStyle w:val="SubtleEmphasis"/>
-        </w:rPr>
-        <w:t>netif_set_default</w:t>
-      </w:r>
-      <w:proofErr w:type="spellEnd"/>
-      <w:r>
-        <w:rPr>
-          <w:rStyle w:val="SubtleEmphasis"/>
-        </w:rPr>
-        <w:t>(&amp;enc28j60_netif);</w:t>
-      </w:r>
-    </w:p>
-    <w:p>
-      <w:pPr>
-        <w:pStyle w:val="Heading1"/>
-        <w:numPr>
-          <w:ilvl w:val="0"/>
-          <w:numId w:val="0"/>
-        </w:numPr>
-        <w:ind w:left="720"/>
-        <w:rPr>
-          <w:rStyle w:val="SubtleEmphasis"/>
-        </w:rPr>
-      </w:pPr>
-      <w:r>
-        <w:rPr>
-          <w:rStyle w:val="SubtleEmphasis"/>
-        </w:rPr>
-        <w:t xml:space="preserve">    </w:t>
-      </w:r>
-      <w:proofErr w:type="spellStart"/>
-      <w:r>
-        <w:rPr>
-          <w:rStyle w:val="SubtleEmphasis"/>
-        </w:rPr>
-        <w:t>netif_set_up</w:t>
-      </w:r>
-      <w:proofErr w:type="spellEnd"/>
-      <w:r>
-        <w:rPr>
-          <w:rStyle w:val="SubtleEmphasis"/>
-        </w:rPr>
-        <w:t>(&amp;enc28j60_netif);</w:t>
+        <w:t xml:space="preserve">    ip4_addr_t ipaddr, netmask, gw;</w:t>
+      </w:r>
+    </w:p>
+    <w:p>
+      <w:pPr>
+        <w:pStyle w:val="Heading1"/>
+        <w:numPr>
+          <w:ilvl w:val="0"/>
+          <w:numId w:val="0"/>
+        </w:numPr>
+        <w:ind w:left="720"/>
+        <w:rPr>
+          <w:rStyle w:val="SubtleEmphasis"/>
+        </w:rPr>
+      </w:pPr>
+      <w:r>
+        <w:rPr>
+          <w:rStyle w:val="SubtleEmphasis"/>
+        </w:rPr>
+        <w:t xml:space="preserve">    IP4_ADDR(&amp;ipaddr, 192, 168, 1, 150);  // Static IP address</w:t>
+      </w:r>
+    </w:p>
+    <w:p>
+      <w:pPr>
+        <w:pStyle w:val="Heading1"/>
+        <w:numPr>
+          <w:ilvl w:val="0"/>
+          <w:numId w:val="0"/>
+        </w:numPr>
+        <w:ind w:left="720"/>
+        <w:rPr>
+          <w:rStyle w:val="SubtleEmphasis"/>
+        </w:rPr>
+      </w:pPr>
+      <w:r>
+        <w:rPr>
+          <w:rStyle w:val="SubtleEmphasis"/>
+        </w:rPr>
+        <w:t xml:space="preserve">    IP4_ADDR(&amp;netmask, 255, 255, 255, 0); // Netmask</w:t>
+      </w:r>
+    </w:p>
+    <w:p>
+      <w:pPr>
+        <w:pStyle w:val="Heading1"/>
+        <w:numPr>
+          <w:ilvl w:val="0"/>
+          <w:numId w:val="0"/>
+        </w:numPr>
+        <w:ind w:left="720"/>
+        <w:rPr>
+          <w:rStyle w:val="SubtleEmphasis"/>
+        </w:rPr>
+      </w:pPr>
+      <w:r>
+        <w:rPr>
+          <w:rStyle w:val="SubtleEmphasis"/>
+        </w:rPr>
+        <w:t xml:space="preserve">    IP4_ADDR(&amp;gw, 192, 168, 1, 1);        // Gateway IP</w:t>
+      </w:r>
+    </w:p>
+    <w:p>
+      <w:pPr>
+        <w:pStyle w:val="Heading1"/>
+        <w:numPr>
+          <w:ilvl w:val="0"/>
+          <w:numId w:val="0"/>
+        </w:numPr>
+        <w:ind w:left="720"/>
+        <w:rPr>
+          <w:rStyle w:val="SubtleEmphasis"/>
+        </w:rPr>
+      </w:pPr>
+    </w:p>
+    <w:p>
+      <w:pPr>
+        <w:pStyle w:val="Heading1"/>
+        <w:numPr>
+          <w:ilvl w:val="0"/>
+          <w:numId w:val="0"/>
+        </w:numPr>
+        <w:ind w:left="720"/>
+        <w:rPr>
+          <w:rStyle w:val="SubtleEmphasis"/>
+        </w:rPr>
+      </w:pPr>
+      <w:r>
+        <w:rPr>
+          <w:rStyle w:val="SubtleEmphasis"/>
+        </w:rPr>
+        <w:t xml:space="preserve">    // 4. Bind ENC28J60 interface to lwIP</w:t>
+      </w:r>
+    </w:p>
+    <w:p>
+      <w:pPr>
+        <w:pStyle w:val="Heading1"/>
+        <w:numPr>
+          <w:ilvl w:val="0"/>
+          <w:numId w:val="0"/>
+        </w:numPr>
+        <w:ind w:left="720"/>
+        <w:rPr>
+          <w:rStyle w:val="SubtleEmphasis"/>
+        </w:rPr>
+      </w:pPr>
+      <w:r>
+        <w:rPr>
+          <w:rStyle w:val="SubtleEmphasis"/>
+        </w:rPr>
+        <w:t xml:space="preserve">    netif_add(&amp;enc28j60_netif, &amp;ipaddr, &amp;netmask, &amp;gw, NULL, &amp;enc28j60_netif_init, &amp;ethernet_input);</w:t>
+      </w:r>
+    </w:p>
+    <w:p>
+      <w:pPr>
+        <w:pStyle w:val="Heading1"/>
+        <w:numPr>
+          <w:ilvl w:val="0"/>
+          <w:numId w:val="0"/>
+        </w:numPr>
+        <w:ind w:left="720"/>
+        <w:rPr>
+          <w:rStyle w:val="SubtleEmphasis"/>
+        </w:rPr>
+      </w:pPr>
+      <w:r>
+        <w:rPr>
+          <w:rStyle w:val="SubtleEmphasis"/>
+        </w:rPr>
+        <w:t xml:space="preserve">    netif_set_default(&amp;enc28j60_netif);</w:t>
+      </w:r>
+    </w:p>
+    <w:p>
+      <w:pPr>
+        <w:pStyle w:val="Heading1"/>
+        <w:numPr>
+          <w:ilvl w:val="0"/>
+          <w:numId w:val="0"/>
+        </w:numPr>
+        <w:ind w:left="720"/>
+        <w:rPr>
+          <w:rStyle w:val="SubtleEmphasis"/>
+        </w:rPr>
+      </w:pPr>
+      <w:r>
+        <w:rPr>
+          <w:rStyle w:val="SubtleEmphasis"/>
+        </w:rPr>
+        <w:t xml:space="preserve">    netif_set_up(&amp;enc28j60_netif);</w:t>
       </w:r>
     </w:p>
     <w:p>
@@ -4819,68 +2951,26 @@
         <w:rPr>
           <w:rStyle w:val="SubtleEmphasis"/>
         </w:rPr>
-        <w:t xml:space="preserve">        // Handle internal </w:t>
-      </w:r>
-      <w:proofErr w:type="spellStart"/>
-      <w:r>
-        <w:rPr>
-          <w:rStyle w:val="SubtleEmphasis"/>
-        </w:rPr>
-        <w:t>lwIP</w:t>
-      </w:r>
-      <w:proofErr w:type="spellEnd"/>
-      <w:r>
-        <w:rPr>
-          <w:rStyle w:val="SubtleEmphasis"/>
-        </w:rPr>
-        <w:t xml:space="preserve"> software timers (ARP, TCP retransmissions, etc.)</w:t>
-      </w:r>
-    </w:p>
-    <w:p>
-      <w:pPr>
-        <w:pStyle w:val="Heading1"/>
-        <w:numPr>
-          <w:ilvl w:val="0"/>
-          <w:numId w:val="0"/>
-        </w:numPr>
-        <w:ind w:left="720"/>
-        <w:rPr>
-          <w:rStyle w:val="SubtleEmphasis"/>
-        </w:rPr>
-      </w:pPr>
-      <w:r>
-        <w:rPr>
-          <w:rStyle w:val="SubtleEmphasis"/>
-        </w:rPr>
-        <w:t xml:space="preserve">        </w:t>
-      </w:r>
-      <w:proofErr w:type="spellStart"/>
-      <w:r>
-        <w:rPr>
-          <w:rStyle w:val="SubtleEmphasis"/>
-        </w:rPr>
-        <w:t>sys_check_</w:t>
-      </w:r>
-      <w:proofErr w:type="gramStart"/>
-      <w:r>
-        <w:rPr>
-          <w:rStyle w:val="SubtleEmphasis"/>
-        </w:rPr>
-        <w:t>timeouts</w:t>
-      </w:r>
-      <w:proofErr w:type="spellEnd"/>
-      <w:r>
-        <w:rPr>
-          <w:rStyle w:val="SubtleEmphasis"/>
-        </w:rPr>
-        <w:t>(</w:t>
-      </w:r>
-      <w:proofErr w:type="gramEnd"/>
-      <w:r>
-        <w:rPr>
-          <w:rStyle w:val="SubtleEmphasis"/>
-        </w:rPr>
-        <w:t>);</w:t>
+        <w:t xml:space="preserve">        // Handle internal lwIP software timers (ARP, TCP retransmissions, etc.)</w:t>
+      </w:r>
+    </w:p>
+    <w:p>
+      <w:pPr>
+        <w:pStyle w:val="Heading1"/>
+        <w:numPr>
+          <w:ilvl w:val="0"/>
+          <w:numId w:val="0"/>
+        </w:numPr>
+        <w:ind w:left="720"/>
+        <w:rPr>
+          <w:rStyle w:val="SubtleEmphasis"/>
+        </w:rPr>
+      </w:pPr>
+      <w:r>
+        <w:rPr>
+          <w:rStyle w:val="SubtleEmphasis"/>
+        </w:rPr>
+        <w:t xml:space="preserve">        sys_check_timeouts();</w:t>
       </w:r>
     </w:p>
     <w:p>
@@ -4950,15 +3040,7 @@
         <w:pStyle w:val="NoSpacing"/>
       </w:pPr>
       <w:r>
-        <w:t xml:space="preserve">SPI Speed Constraints: The ENC28J60 clock maxes out at a 20 MHz SPI clock frequency. Ensure your microcontroller's SPI </w:t>
-      </w:r>
-      <w:proofErr w:type="spellStart"/>
-      <w:r>
-        <w:t>prescaler</w:t>
-      </w:r>
-      <w:proofErr w:type="spellEnd"/>
-      <w:r>
-        <w:t xml:space="preserve"> doesn't exceed this limit. [</w:t>
+        <w:t>SPI Speed Constraints: The ENC28J60 clock maxes out at a 20 MHz SPI clock frequency. Ensure your microcontroller's SPI prescaler doesn't exceed this limit. [</w:t>
       </w:r>
       <w:hyperlink r:id="rId15" w:history="1">
         <w:r>
@@ -5032,45 +3114,15 @@
         <w:t xml:space="preserve">Pre-made Driver Examples: If you are using popular hardware platforms, you can reference the </w:t>
       </w:r>
       <w:hyperlink r:id="rId20" w:tgtFrame="_blank" w:history="1">
-        <w:proofErr w:type="spellStart"/>
         <w:r>
           <w:rPr>
             <w:rStyle w:val="Hyperlink"/>
           </w:rPr>
-          <w:t>Juddling</w:t>
-        </w:r>
-        <w:proofErr w:type="spellEnd"/>
-        <w:r>
-          <w:rPr>
-            <w:rStyle w:val="Hyperlink"/>
-          </w:rPr>
-          <w:t xml:space="preserve"> Raspberry Pi Pico </w:t>
-        </w:r>
-        <w:proofErr w:type="spellStart"/>
-        <w:r>
-          <w:rPr>
-            <w:rStyle w:val="Hyperlink"/>
-          </w:rPr>
-          <w:t>lwIP</w:t>
-        </w:r>
-        <w:proofErr w:type="spellEnd"/>
-        <w:r>
-          <w:rPr>
-            <w:rStyle w:val="Hyperlink"/>
-          </w:rPr>
-          <w:t xml:space="preserve"> Port</w:t>
+          <w:t>Juddling Raspberry Pi Pico lwIP Port</w:t>
         </w:r>
       </w:hyperlink>
       <w:r>
-        <w:t xml:space="preserve"> or the </w:t>
-      </w:r>
-      <w:proofErr w:type="spellStart"/>
-      <w:r>
-        <w:t>matwey</w:t>
-      </w:r>
-      <w:proofErr w:type="spellEnd"/>
-      <w:r>
-        <w:t xml:space="preserve"> generic C port for full implementations of the low-level SPI register maps. [</w:t>
+        <w:t xml:space="preserve"> or the matwey generic C port for full implementations of the low-level SPI register maps. [</w:t>
       </w:r>
       <w:hyperlink r:id="rId21" w:history="1">
         <w:r>
@@ -5395,6 +3447,22 @@
       </w:hyperlink>
     </w:p>
     <w:p>
+      <w:pPr>
+        <w:pStyle w:val="Heading1"/>
+      </w:pPr>
+      <w:hyperlink r:id="rId28" w:history="1">
+        <w:r>
+          <w:rPr>
+            <w:rStyle w:val="Hyperlink"/>
+          </w:rPr>
+          <w:t>https://github.com/adamdunkels/uip</w:t>
+        </w:r>
+      </w:hyperlink>
+      <w:r>
+        <w:t xml:space="preserve"> (uIP stack)</w:t>
+      </w:r>
+    </w:p>
+    <w:p>
       <w:r>
         <w:t>--------------- Debugging needed ------------------</w:t>
       </w:r>
@@ -5462,11 +3530,7 @@
         <w:t xml:space="preserve"> </w:t>
       </w:r>
       <w:r>
-        <w:t xml:space="preserve">Additionally, to prevent unexpected packets from arriving, it </w:t>
-      </w:r>
-      <w:proofErr w:type="gramStart"/>
-      <w:r>
-        <w:t>is</w:t>
+        <w:t>Additionally, to prevent unexpected packets from arriving, it is</w:t>
       </w:r>
       <w:r>
         <w:t xml:space="preserve"> </w:t>
@@ -5475,11 +3539,7 @@
         <w:t xml:space="preserve"> </w:t>
       </w:r>
       <w:r>
-        <w:t>recommended</w:t>
-      </w:r>
-      <w:proofErr w:type="gramEnd"/>
-      <w:r>
-        <w:t xml:space="preserve"> that RXEN be cleared before</w:t>
+        <w:t>recommended that RXEN be cleared before</w:t>
       </w:r>
       <w:r>
         <w:t xml:space="preserve"> </w:t>
@@ -5491,13 +3551,8 @@
         <w:t xml:space="preserve"> </w:t>
       </w:r>
       <w:r>
-        <w:t xml:space="preserve">MAC </w:t>
-      </w:r>
-      <w:proofErr w:type="gramStart"/>
-      <w:r>
-        <w:t>address )</w:t>
-      </w:r>
-      <w:proofErr w:type="gramEnd"/>
+        <w:t>MAC address )</w:t>
+      </w:r>
       <w:r>
         <w:t xml:space="preserve"> </w:t>
       </w:r>
@@ -5531,16 +3586,11 @@
         </w:rPr>
         <w:t xml:space="preserve"> </w:t>
       </w:r>
-      <w:proofErr w:type="gramStart"/>
       <w:r>
         <w:t>PLOOPBK</w:t>
       </w:r>
       <w:r>
-        <w:t>(</w:t>
-      </w:r>
-      <w:proofErr w:type="gramEnd"/>
-      <w:r>
-        <w:t>14)</w:t>
+        <w:t>(14)</w:t>
       </w:r>
       <w:r>
         <w:t xml:space="preserve"> // Loopback mode on</w:t>
@@ -5551,15 +3601,8 @@
         <w:pStyle w:val="NoSpacing"/>
       </w:pPr>
       <w:r>
-        <w:t xml:space="preserve">bit 8 PDPXMD: PHY Duplex Mode </w:t>
-      </w:r>
-      <w:proofErr w:type="gramStart"/>
-      <w:r>
-        <w:t>bit(</w:t>
-      </w:r>
-      <w:proofErr w:type="gramEnd"/>
-      <w:r>
-        <w:t>1)</w:t>
+        <w:lastRenderedPageBreak/>
+        <w:t>bit 8 PDPXMD: PHY Duplex Mode bit(1)</w:t>
       </w:r>
       <w:r>
         <w:tab/>
@@ -5578,7 +3621,6 @@
           <w:rFonts w:ascii="CourierNew" w:hAnsi="CourierNew" w:cs="Times New Roman"/>
           <w:lang w:eastAsia="en-IN"/>
         </w:rPr>
-        <w:lastRenderedPageBreak/>
         <w:t xml:space="preserve">1 </w:t>
       </w:r>
       <w:r>
@@ -5629,16 +3671,11 @@
       <w:r>
         <w:t>MACON3-&gt;</w:t>
       </w:r>
-      <w:proofErr w:type="gramStart"/>
       <w:r>
         <w:t>FULDPX</w:t>
       </w:r>
       <w:r>
-        <w:t>(</w:t>
-      </w:r>
-      <w:proofErr w:type="gramEnd"/>
-      <w:r>
-        <w:t>0)</w:t>
+        <w:t>(0)</w:t>
       </w:r>
     </w:p>
     <w:p>
@@ -5648,16 +3685,11 @@
       <w:r>
         <w:t>PHCON1-&gt;</w:t>
       </w:r>
-      <w:proofErr w:type="gramStart"/>
       <w:r>
         <w:t>PDPXMD</w:t>
       </w:r>
       <w:r>
-        <w:t>(</w:t>
-      </w:r>
-      <w:proofErr w:type="gramEnd"/>
-      <w:r>
-        <w:t>8)</w:t>
+        <w:t>(8)</w:t>
       </w:r>
     </w:p>
     <w:p>
@@ -5679,24 +3711,11 @@
       <w:pPr>
         <w:pStyle w:val="NoSpacing"/>
       </w:pPr>
-      <w:proofErr w:type="spellStart"/>
-      <w:r>
-        <w:t>Packats</w:t>
-      </w:r>
-      <w:proofErr w:type="spellEnd"/>
-      <w:r>
-        <w:t xml:space="preserve"> only from MAC “</w:t>
-      </w:r>
-      <w:r>
-        <w:t>50:46:5</w:t>
-      </w:r>
-      <w:proofErr w:type="gramStart"/>
-      <w:r>
-        <w:t>D:4C:D6</w:t>
-      </w:r>
-      <w:proofErr w:type="gramEnd"/>
-      <w:r>
-        <w:t>:D0</w:t>
+      <w:r>
+        <w:t>Packats only from MAC “</w:t>
+      </w:r>
+      <w:r>
+        <w:t>50:46:5D:4C:D6:D0</w:t>
       </w:r>
       <w:r>
         <w:t>” will be accepted.</w:t>
@@ -5833,7 +3852,6 @@
       <w:pPr>
         <w:pStyle w:val="NoSpacing"/>
       </w:pPr>
-      <w:proofErr w:type="gramStart"/>
       <w:r>
         <w:rPr>
           <w:b/>
@@ -5853,76 +3871,59 @@
           <w:b/>
           <w:bCs/>
         </w:rPr>
-        <w:t>:EPMOL</w:t>
-      </w:r>
-      <w:proofErr w:type="gramEnd"/>
+        <w:t>:EPMOL = 000</w:t>
+      </w:r>
       <w:r>
         <w:rPr>
           <w:b/>
           <w:bCs/>
         </w:rPr>
-        <w:t xml:space="preserve"> = 000</w:t>
+        <w:t>0</w:t>
       </w:r>
       <w:r>
         <w:rPr>
           <w:b/>
           <w:bCs/>
         </w:rPr>
-        <w:t>0</w:t>
-      </w:r>
+        <w:t>h</w:t>
+      </w:r>
+    </w:p>
+    <w:p>
+      <w:pPr>
+        <w:pStyle w:val="NoSpacing"/>
+      </w:pPr>
       <w:r>
         <w:rPr>
           <w:b/>
           <w:bCs/>
         </w:rPr>
-        <w:t>h</w:t>
-      </w:r>
-    </w:p>
-    <w:p>
-      <w:pPr>
-        <w:pStyle w:val="NoSpacing"/>
-      </w:pPr>
+        <w:t>EPMM7:EPMM0 = 000000000000</w:t>
+      </w:r>
       <w:r>
         <w:rPr>
           <w:b/>
           <w:bCs/>
         </w:rPr>
-        <w:t>EPMM7:EPMM0 = 000000000000</w:t>
+        <w:t>0FC0</w:t>
       </w:r>
       <w:r>
         <w:rPr>
           <w:b/>
           <w:bCs/>
         </w:rPr>
-        <w:t>0FC0</w:t>
-      </w:r>
+        <w:t>h</w:t>
+      </w:r>
+    </w:p>
+    <w:p>
+      <w:pPr>
+        <w:pStyle w:val="NoSpacing"/>
+      </w:pPr>
       <w:r>
         <w:rPr>
           <w:b/>
           <w:bCs/>
         </w:rPr>
-        <w:t>h</w:t>
-      </w:r>
-    </w:p>
-    <w:p>
-      <w:pPr>
-        <w:pStyle w:val="NoSpacing"/>
-      </w:pPr>
-      <w:proofErr w:type="gramStart"/>
-      <w:r>
-        <w:rPr>
-          <w:b/>
-          <w:bCs/>
-        </w:rPr>
-        <w:t>EPMCSH:EPMCSL</w:t>
-      </w:r>
-      <w:proofErr w:type="gramEnd"/>
-      <w:r>
-        <w:rPr>
-          <w:b/>
-          <w:bCs/>
-        </w:rPr>
-        <w:t xml:space="preserve"> = </w:t>
+        <w:t xml:space="preserve">EPMCSH:EPMCSL = </w:t>
       </w:r>
       <w:r>
         <w:rPr>

</xml_diff>